<commit_message>
docs(parcial-2): CU-40 copias de seguridad de la empresa, diferenciado por plan
Aporte propio, basado en lo que se hizo en PROYECTO_MEDICOS (backend/backups):
copia lógica en JSON solo con los datos de la empresa; las manuales se
descargan y no se guardan; las automáticas se guardan cifradas y se conservan
las últimas N; la frecuencia y la retención las da el plan (Básico semanal y 4,
Profesional diaria y 7, Empresarial a voluntad y 30); restaurar nunca lo limita
el plan y reemplaza los datos en una sola transacción.

- RF-60 a RF-63, RNF17, RN-18 y RN-19; tres filas nuevas en la tabla de planes.
- Va al final de la presentación 3 (CU-40), así no se renumera nada.
- Reparto: el CU-40 es de Luis (20 y 20); Luis carga todos los mensajes de la
  robustez y Karen hace todos los diagramas de secuencia.

Co-Authored-By: Claude Opus 5.5 <noreply@anthropic.com>
</commit_message>
<xml_diff>
--- a/SI2 Ex2 Grupo 15.docx
+++ b/SI2 Ex2 Grupo 15.docx
@@ -1327,7 +1327,7 @@
           <w:r>
             <w:fldChar w:fldCharType="separate"/>
           </w:r>
-          <w:hyperlink w:anchor="_Toc243616989" w:history="1">
+          <w:hyperlink w:anchor="_Toc243618578" w:history="1">
             <w:r>
               <w:rPr>
                 <w:rStyle w:val="Hipervnculo"/>
@@ -1350,7 +1350,7 @@
               <w:rPr>
                 <w:webHidden/>
               </w:rPr>
-              <w:instrText xml:space="preserve"> PAGEREF _Toc243616989 \h </w:instrText>
+              <w:instrText xml:space="preserve"> PAGEREF _Toc243618578 \h </w:instrText>
             </w:r>
             <w:r>
               <w:rPr>
@@ -1392,7 +1392,7 @@
               <w14:ligatures w14:val="standardContextual"/>
             </w:rPr>
           </w:pPr>
-          <w:hyperlink w:anchor="_Toc243616990" w:history="1">
+          <w:hyperlink w:anchor="_Toc243618579" w:history="1">
             <w:r>
               <w:rPr>
                 <w:rStyle w:val="Hipervnculo"/>
@@ -1419,7 +1419,7 @@
                 <w:noProof/>
                 <w:webHidden/>
               </w:rPr>
-              <w:instrText xml:space="preserve"> PAGEREF _Toc243616990 \h </w:instrText>
+              <w:instrText xml:space="preserve"> PAGEREF _Toc243618579 \h </w:instrText>
             </w:r>
             <w:r>
               <w:rPr>
@@ -1465,7 +1465,7 @@
               <w14:ligatures w14:val="standardContextual"/>
             </w:rPr>
           </w:pPr>
-          <w:hyperlink w:anchor="_Toc243616991" w:history="1">
+          <w:hyperlink w:anchor="_Toc243618580" w:history="1">
             <w:r>
               <w:rPr>
                 <w:rStyle w:val="Hipervnculo"/>
@@ -1492,7 +1492,7 @@
                 <w:noProof/>
                 <w:webHidden/>
               </w:rPr>
-              <w:instrText xml:space="preserve"> PAGEREF _Toc243616991 \h </w:instrText>
+              <w:instrText xml:space="preserve"> PAGEREF _Toc243618580 \h </w:instrText>
             </w:r>
             <w:r>
               <w:rPr>
@@ -1538,7 +1538,7 @@
               <w14:ligatures w14:val="standardContextual"/>
             </w:rPr>
           </w:pPr>
-          <w:hyperlink w:anchor="_Toc243616992" w:history="1">
+          <w:hyperlink w:anchor="_Toc243618581" w:history="1">
             <w:r>
               <w:rPr>
                 <w:rStyle w:val="Hipervnculo"/>
@@ -1565,7 +1565,7 @@
                 <w:noProof/>
                 <w:webHidden/>
               </w:rPr>
-              <w:instrText xml:space="preserve"> PAGEREF _Toc243616992 \h </w:instrText>
+              <w:instrText xml:space="preserve"> PAGEREF _Toc243618581 \h </w:instrText>
             </w:r>
             <w:r>
               <w:rPr>
@@ -1611,7 +1611,7 @@
               <w14:ligatures w14:val="standardContextual"/>
             </w:rPr>
           </w:pPr>
-          <w:hyperlink w:anchor="_Toc243616993" w:history="1">
+          <w:hyperlink w:anchor="_Toc243618582" w:history="1">
             <w:r>
               <w:rPr>
                 <w:rStyle w:val="Hipervnculo"/>
@@ -1638,7 +1638,7 @@
                 <w:noProof/>
                 <w:webHidden/>
               </w:rPr>
-              <w:instrText xml:space="preserve"> PAGEREF _Toc243616993 \h </w:instrText>
+              <w:instrText xml:space="preserve"> PAGEREF _Toc243618582 \h </w:instrText>
             </w:r>
             <w:r>
               <w:rPr>
@@ -1684,7 +1684,7 @@
               <w14:ligatures w14:val="standardContextual"/>
             </w:rPr>
           </w:pPr>
-          <w:hyperlink w:anchor="_Toc243616994" w:history="1">
+          <w:hyperlink w:anchor="_Toc243618583" w:history="1">
             <w:r>
               <w:rPr>
                 <w:rStyle w:val="Hipervnculo"/>
@@ -1711,7 +1711,7 @@
                 <w:noProof/>
                 <w:webHidden/>
               </w:rPr>
-              <w:instrText xml:space="preserve"> PAGEREF _Toc243616994 \h </w:instrText>
+              <w:instrText xml:space="preserve"> PAGEREF _Toc243618583 \h </w:instrText>
             </w:r>
             <w:r>
               <w:rPr>
@@ -1757,7 +1757,7 @@
               <w14:ligatures w14:val="standardContextual"/>
             </w:rPr>
           </w:pPr>
-          <w:hyperlink w:anchor="_Toc243616995" w:history="1">
+          <w:hyperlink w:anchor="_Toc243618584" w:history="1">
             <w:r>
               <w:rPr>
                 <w:rStyle w:val="Hipervnculo"/>
@@ -1784,7 +1784,7 @@
                 <w:noProof/>
                 <w:webHidden/>
               </w:rPr>
-              <w:instrText xml:space="preserve"> PAGEREF _Toc243616995 \h </w:instrText>
+              <w:instrText xml:space="preserve"> PAGEREF _Toc243618584 \h </w:instrText>
             </w:r>
             <w:r>
               <w:rPr>
@@ -1830,7 +1830,7 @@
               <w14:ligatures w14:val="standardContextual"/>
             </w:rPr>
           </w:pPr>
-          <w:hyperlink w:anchor="_Toc243616996" w:history="1">
+          <w:hyperlink w:anchor="_Toc243618585" w:history="1">
             <w:r>
               <w:rPr>
                 <w:rStyle w:val="Hipervnculo"/>
@@ -1857,7 +1857,7 @@
                 <w:noProof/>
                 <w:webHidden/>
               </w:rPr>
-              <w:instrText xml:space="preserve"> PAGEREF _Toc243616996 \h </w:instrText>
+              <w:instrText xml:space="preserve"> PAGEREF _Toc243618585 \h </w:instrText>
             </w:r>
             <w:r>
               <w:rPr>
@@ -1903,7 +1903,7 @@
               <w14:ligatures w14:val="standardContextual"/>
             </w:rPr>
           </w:pPr>
-          <w:hyperlink w:anchor="_Toc243616997" w:history="1">
+          <w:hyperlink w:anchor="_Toc243618586" w:history="1">
             <w:r>
               <w:rPr>
                 <w:rStyle w:val="Hipervnculo"/>
@@ -1930,7 +1930,7 @@
                 <w:noProof/>
                 <w:webHidden/>
               </w:rPr>
-              <w:instrText xml:space="preserve"> PAGEREF _Toc243616997 \h </w:instrText>
+              <w:instrText xml:space="preserve"> PAGEREF _Toc243618586 \h </w:instrText>
             </w:r>
             <w:r>
               <w:rPr>
@@ -1976,7 +1976,7 @@
               <w14:ligatures w14:val="standardContextual"/>
             </w:rPr>
           </w:pPr>
-          <w:hyperlink w:anchor="_Toc243616998" w:history="1">
+          <w:hyperlink w:anchor="_Toc243618587" w:history="1">
             <w:r>
               <w:rPr>
                 <w:rStyle w:val="Hipervnculo"/>
@@ -2003,7 +2003,7 @@
                 <w:noProof/>
                 <w:webHidden/>
               </w:rPr>
-              <w:instrText xml:space="preserve"> PAGEREF _Toc243616998 \h </w:instrText>
+              <w:instrText xml:space="preserve"> PAGEREF _Toc243618587 \h </w:instrText>
             </w:r>
             <w:r>
               <w:rPr>
@@ -2049,7 +2049,7 @@
               <w14:ligatures w14:val="standardContextual"/>
             </w:rPr>
           </w:pPr>
-          <w:hyperlink w:anchor="_Toc243616999" w:history="1">
+          <w:hyperlink w:anchor="_Toc243618588" w:history="1">
             <w:r>
               <w:rPr>
                 <w:rStyle w:val="Hipervnculo"/>
@@ -2076,7 +2076,7 @@
                 <w:noProof/>
                 <w:webHidden/>
               </w:rPr>
-              <w:instrText xml:space="preserve"> PAGEREF _Toc243616999 \h </w:instrText>
+              <w:instrText xml:space="preserve"> PAGEREF _Toc243618588 \h </w:instrText>
             </w:r>
             <w:r>
               <w:rPr>
@@ -2120,7 +2120,7 @@
               <w14:ligatures w14:val="standardContextual"/>
             </w:rPr>
           </w:pPr>
-          <w:hyperlink w:anchor="_Toc243617000" w:history="1">
+          <w:hyperlink w:anchor="_Toc243618589" w:history="1">
             <w:r>
               <w:rPr>
                 <w:rStyle w:val="Hipervnculo"/>
@@ -2143,7 +2143,7 @@
               <w:rPr>
                 <w:webHidden/>
               </w:rPr>
-              <w:instrText xml:space="preserve"> PAGEREF _Toc243617000 \h </w:instrText>
+              <w:instrText xml:space="preserve"> PAGEREF _Toc243618589 \h </w:instrText>
             </w:r>
             <w:r>
               <w:rPr>
@@ -2185,7 +2185,7 @@
               <w14:ligatures w14:val="standardContextual"/>
             </w:rPr>
           </w:pPr>
-          <w:hyperlink w:anchor="_Toc243617001" w:history="1">
+          <w:hyperlink w:anchor="_Toc243618590" w:history="1">
             <w:r>
               <w:rPr>
                 <w:rStyle w:val="Hipervnculo"/>
@@ -2212,7 +2212,7 @@
                 <w:noProof/>
                 <w:webHidden/>
               </w:rPr>
-              <w:instrText xml:space="preserve"> PAGEREF _Toc243617001 \h </w:instrText>
+              <w:instrText xml:space="preserve"> PAGEREF _Toc243618590 \h </w:instrText>
             </w:r>
             <w:r>
               <w:rPr>
@@ -2258,7 +2258,7 @@
               <w14:ligatures w14:val="standardContextual"/>
             </w:rPr>
           </w:pPr>
-          <w:hyperlink w:anchor="_Toc243617002" w:history="1">
+          <w:hyperlink w:anchor="_Toc243618591" w:history="1">
             <w:r>
               <w:rPr>
                 <w:rStyle w:val="Hipervnculo"/>
@@ -2285,7 +2285,7 @@
                 <w:noProof/>
                 <w:webHidden/>
               </w:rPr>
-              <w:instrText xml:space="preserve"> PAGEREF _Toc243617002 \h </w:instrText>
+              <w:instrText xml:space="preserve"> PAGEREF _Toc243618591 \h </w:instrText>
             </w:r>
             <w:r>
               <w:rPr>
@@ -2331,7 +2331,7 @@
               <w14:ligatures w14:val="standardContextual"/>
             </w:rPr>
           </w:pPr>
-          <w:hyperlink w:anchor="_Toc243617003" w:history="1">
+          <w:hyperlink w:anchor="_Toc243618592" w:history="1">
             <w:r>
               <w:rPr>
                 <w:rStyle w:val="Hipervnculo"/>
@@ -2358,7 +2358,7 @@
                 <w:noProof/>
                 <w:webHidden/>
               </w:rPr>
-              <w:instrText xml:space="preserve"> PAGEREF _Toc243617003 \h </w:instrText>
+              <w:instrText xml:space="preserve"> PAGEREF _Toc243618592 \h </w:instrText>
             </w:r>
             <w:r>
               <w:rPr>
@@ -2404,7 +2404,7 @@
               <w14:ligatures w14:val="standardContextual"/>
             </w:rPr>
           </w:pPr>
-          <w:hyperlink w:anchor="_Toc243617004" w:history="1">
+          <w:hyperlink w:anchor="_Toc243618593" w:history="1">
             <w:r>
               <w:rPr>
                 <w:rStyle w:val="Hipervnculo"/>
@@ -2431,7 +2431,7 @@
                 <w:noProof/>
                 <w:webHidden/>
               </w:rPr>
-              <w:instrText xml:space="preserve"> PAGEREF _Toc243617004 \h </w:instrText>
+              <w:instrText xml:space="preserve"> PAGEREF _Toc243618593 \h </w:instrText>
             </w:r>
             <w:r>
               <w:rPr>
@@ -2477,7 +2477,7 @@
               <w14:ligatures w14:val="standardContextual"/>
             </w:rPr>
           </w:pPr>
-          <w:hyperlink w:anchor="_Toc243617005" w:history="1">
+          <w:hyperlink w:anchor="_Toc243618594" w:history="1">
             <w:r>
               <w:rPr>
                 <w:rStyle w:val="Hipervnculo"/>
@@ -2504,7 +2504,7 @@
                 <w:noProof/>
                 <w:webHidden/>
               </w:rPr>
-              <w:instrText xml:space="preserve"> PAGEREF _Toc243617005 \h </w:instrText>
+              <w:instrText xml:space="preserve"> PAGEREF _Toc243618594 \h </w:instrText>
             </w:r>
             <w:r>
               <w:rPr>
@@ -2550,7 +2550,7 @@
               <w14:ligatures w14:val="standardContextual"/>
             </w:rPr>
           </w:pPr>
-          <w:hyperlink w:anchor="_Toc243617006" w:history="1">
+          <w:hyperlink w:anchor="_Toc243618595" w:history="1">
             <w:r>
               <w:rPr>
                 <w:rStyle w:val="Hipervnculo"/>
@@ -2577,7 +2577,7 @@
                 <w:noProof/>
                 <w:webHidden/>
               </w:rPr>
-              <w:instrText xml:space="preserve"> PAGEREF _Toc243617006 \h </w:instrText>
+              <w:instrText xml:space="preserve"> PAGEREF _Toc243618595 \h </w:instrText>
             </w:r>
             <w:r>
               <w:rPr>
@@ -2597,7 +2597,7 @@
                 <w:noProof/>
                 <w:webHidden/>
               </w:rPr>
-              <w:t>15</w:t>
+              <w:t>16</w:t>
             </w:r>
             <w:r>
               <w:rPr>
@@ -2623,7 +2623,7 @@
               <w14:ligatures w14:val="standardContextual"/>
             </w:rPr>
           </w:pPr>
-          <w:hyperlink w:anchor="_Toc243617007" w:history="1">
+          <w:hyperlink w:anchor="_Toc243618596" w:history="1">
             <w:r>
               <w:rPr>
                 <w:rStyle w:val="Hipervnculo"/>
@@ -2658,7 +2658,7 @@
                 <w:noProof/>
                 <w:webHidden/>
               </w:rPr>
-              <w:instrText xml:space="preserve"> PAGEREF _Toc243617007 \h </w:instrText>
+              <w:instrText xml:space="preserve"> PAGEREF _Toc243618596 \h </w:instrText>
             </w:r>
             <w:r>
               <w:rPr>
@@ -2704,7 +2704,7 @@
               <w14:ligatures w14:val="standardContextual"/>
             </w:rPr>
           </w:pPr>
-          <w:hyperlink w:anchor="_Toc243617008" w:history="1">
+          <w:hyperlink w:anchor="_Toc243618597" w:history="1">
             <w:r>
               <w:rPr>
                 <w:rStyle w:val="Hipervnculo"/>
@@ -2731,7 +2731,7 @@
                 <w:noProof/>
                 <w:webHidden/>
               </w:rPr>
-              <w:instrText xml:space="preserve"> PAGEREF _Toc243617008 \h </w:instrText>
+              <w:instrText xml:space="preserve"> PAGEREF _Toc243618597 \h </w:instrText>
             </w:r>
             <w:r>
               <w:rPr>
@@ -2751,7 +2751,7 @@
                 <w:noProof/>
                 <w:webHidden/>
               </w:rPr>
-              <w:t>18</w:t>
+              <w:t>19</w:t>
             </w:r>
             <w:r>
               <w:rPr>
@@ -2777,7 +2777,7 @@
               <w14:ligatures w14:val="standardContextual"/>
             </w:rPr>
           </w:pPr>
-          <w:hyperlink w:anchor="_Toc243617009" w:history="1">
+          <w:hyperlink w:anchor="_Toc243618598" w:history="1">
             <w:r>
               <w:rPr>
                 <w:rStyle w:val="Hipervnculo"/>
@@ -2804,7 +2804,7 @@
                 <w:noProof/>
                 <w:webHidden/>
               </w:rPr>
-              <w:instrText xml:space="preserve"> PAGEREF _Toc243617009 \h </w:instrText>
+              <w:instrText xml:space="preserve"> PAGEREF _Toc243618598 \h </w:instrText>
             </w:r>
             <w:r>
               <w:rPr>
@@ -2850,7 +2850,7 @@
               <w14:ligatures w14:val="standardContextual"/>
             </w:rPr>
           </w:pPr>
-          <w:hyperlink w:anchor="_Toc243617010" w:history="1">
+          <w:hyperlink w:anchor="_Toc243618599" w:history="1">
             <w:r>
               <w:rPr>
                 <w:rStyle w:val="Hipervnculo"/>
@@ -2877,7 +2877,7 @@
                 <w:noProof/>
                 <w:webHidden/>
               </w:rPr>
-              <w:instrText xml:space="preserve"> PAGEREF _Toc243617010 \h </w:instrText>
+              <w:instrText xml:space="preserve"> PAGEREF _Toc243618599 \h </w:instrText>
             </w:r>
             <w:r>
               <w:rPr>
@@ -2923,7 +2923,7 @@
               <w14:ligatures w14:val="standardContextual"/>
             </w:rPr>
           </w:pPr>
-          <w:hyperlink w:anchor="_Toc243617011" w:history="1">
+          <w:hyperlink w:anchor="_Toc243618600" w:history="1">
             <w:r>
               <w:rPr>
                 <w:rStyle w:val="Hipervnculo"/>
@@ -2950,7 +2950,7 @@
                 <w:noProof/>
                 <w:webHidden/>
               </w:rPr>
-              <w:instrText xml:space="preserve"> PAGEREF _Toc243617011 \h </w:instrText>
+              <w:instrText xml:space="preserve"> PAGEREF _Toc243618600 \h </w:instrText>
             </w:r>
             <w:r>
               <w:rPr>
@@ -2970,7 +2970,7 @@
                 <w:noProof/>
                 <w:webHidden/>
               </w:rPr>
-              <w:t>25</w:t>
+              <w:t>26</w:t>
             </w:r>
             <w:r>
               <w:rPr>
@@ -2996,7 +2996,7 @@
               <w14:ligatures w14:val="standardContextual"/>
             </w:rPr>
           </w:pPr>
-          <w:hyperlink w:anchor="_Toc243617012" w:history="1">
+          <w:hyperlink w:anchor="_Toc243618601" w:history="1">
             <w:r>
               <w:rPr>
                 <w:rStyle w:val="Hipervnculo"/>
@@ -3023,7 +3023,7 @@
                 <w:noProof/>
                 <w:webHidden/>
               </w:rPr>
-              <w:instrText xml:space="preserve"> PAGEREF _Toc243617012 \h </w:instrText>
+              <w:instrText xml:space="preserve"> PAGEREF _Toc243618601 \h </w:instrText>
             </w:r>
             <w:r>
               <w:rPr>
@@ -3043,7 +3043,7 @@
                 <w:noProof/>
                 <w:webHidden/>
               </w:rPr>
-              <w:t>34</w:t>
+              <w:t>35</w:t>
             </w:r>
             <w:r>
               <w:rPr>
@@ -3067,7 +3067,7 @@
               <w14:ligatures w14:val="standardContextual"/>
             </w:rPr>
           </w:pPr>
-          <w:hyperlink w:anchor="_Toc243617013" w:history="1">
+          <w:hyperlink w:anchor="_Toc243618602" w:history="1">
             <w:r>
               <w:rPr>
                 <w:rStyle w:val="Hipervnculo"/>
@@ -3090,7 +3090,7 @@
               <w:rPr>
                 <w:webHidden/>
               </w:rPr>
-              <w:instrText xml:space="preserve"> PAGEREF _Toc243617013 \h </w:instrText>
+              <w:instrText xml:space="preserve"> PAGEREF _Toc243618602 \h </w:instrText>
             </w:r>
             <w:r>
               <w:rPr>
@@ -3107,7 +3107,7 @@
               <w:rPr>
                 <w:webHidden/>
               </w:rPr>
-              <w:t>35</w:t>
+              <w:t>36</w:t>
             </w:r>
             <w:r>
               <w:rPr>
@@ -3132,7 +3132,7 @@
               <w14:ligatures w14:val="standardContextual"/>
             </w:rPr>
           </w:pPr>
-          <w:hyperlink w:anchor="_Toc243617014" w:history="1">
+          <w:hyperlink w:anchor="_Toc243618603" w:history="1">
             <w:r>
               <w:rPr>
                 <w:rStyle w:val="Hipervnculo"/>
@@ -3159,7 +3159,7 @@
                 <w:noProof/>
                 <w:webHidden/>
               </w:rPr>
-              <w:instrText xml:space="preserve"> PAGEREF _Toc243617014 \h </w:instrText>
+              <w:instrText xml:space="preserve"> PAGEREF _Toc243618603 \h </w:instrText>
             </w:r>
             <w:r>
               <w:rPr>
@@ -3179,7 +3179,7 @@
                 <w:noProof/>
                 <w:webHidden/>
               </w:rPr>
-              <w:t>35</w:t>
+              <w:t>36</w:t>
             </w:r>
             <w:r>
               <w:rPr>
@@ -3205,7 +3205,7 @@
               <w14:ligatures w14:val="standardContextual"/>
             </w:rPr>
           </w:pPr>
-          <w:hyperlink w:anchor="_Toc243617015" w:history="1">
+          <w:hyperlink w:anchor="_Toc243618604" w:history="1">
             <w:r>
               <w:rPr>
                 <w:rStyle w:val="Hipervnculo"/>
@@ -3232,7 +3232,7 @@
                 <w:noProof/>
                 <w:webHidden/>
               </w:rPr>
-              <w:instrText xml:space="preserve"> PAGEREF _Toc243617015 \h </w:instrText>
+              <w:instrText xml:space="preserve"> PAGEREF _Toc243618604 \h </w:instrText>
             </w:r>
             <w:r>
               <w:rPr>
@@ -3252,7 +3252,7 @@
                 <w:noProof/>
                 <w:webHidden/>
               </w:rPr>
-              <w:t>36</w:t>
+              <w:t>37</w:t>
             </w:r>
             <w:r>
               <w:rPr>
@@ -3278,7 +3278,7 @@
               <w14:ligatures w14:val="standardContextual"/>
             </w:rPr>
           </w:pPr>
-          <w:hyperlink w:anchor="_Toc243617016" w:history="1">
+          <w:hyperlink w:anchor="_Toc243618605" w:history="1">
             <w:r>
               <w:rPr>
                 <w:rStyle w:val="Hipervnculo"/>
@@ -3305,7 +3305,7 @@
                 <w:noProof/>
                 <w:webHidden/>
               </w:rPr>
-              <w:instrText xml:space="preserve"> PAGEREF _Toc243617016 \h </w:instrText>
+              <w:instrText xml:space="preserve"> PAGEREF _Toc243618605 \h </w:instrText>
             </w:r>
             <w:r>
               <w:rPr>
@@ -3325,7 +3325,7 @@
                 <w:noProof/>
                 <w:webHidden/>
               </w:rPr>
-              <w:t>39</w:t>
+              <w:t>40</w:t>
             </w:r>
             <w:r>
               <w:rPr>
@@ -3351,7 +3351,7 @@
               <w14:ligatures w14:val="standardContextual"/>
             </w:rPr>
           </w:pPr>
-          <w:hyperlink w:anchor="_Toc243617017" w:history="1">
+          <w:hyperlink w:anchor="_Toc243618606" w:history="1">
             <w:r>
               <w:rPr>
                 <w:rStyle w:val="Hipervnculo"/>
@@ -3378,7 +3378,7 @@
                 <w:noProof/>
                 <w:webHidden/>
               </w:rPr>
-              <w:instrText xml:space="preserve"> PAGEREF _Toc243617017 \h </w:instrText>
+              <w:instrText xml:space="preserve"> PAGEREF _Toc243618606 \h </w:instrText>
             </w:r>
             <w:r>
               <w:rPr>
@@ -3398,7 +3398,7 @@
                 <w:noProof/>
                 <w:webHidden/>
               </w:rPr>
-              <w:t>39</w:t>
+              <w:t>40</w:t>
             </w:r>
             <w:r>
               <w:rPr>
@@ -3424,7 +3424,7 @@
               <w14:ligatures w14:val="standardContextual"/>
             </w:rPr>
           </w:pPr>
-          <w:hyperlink w:anchor="_Toc243617018" w:history="1">
+          <w:hyperlink w:anchor="_Toc243618607" w:history="1">
             <w:r>
               <w:rPr>
                 <w:rStyle w:val="Hipervnculo"/>
@@ -3451,7 +3451,7 @@
                 <w:noProof/>
                 <w:webHidden/>
               </w:rPr>
-              <w:instrText xml:space="preserve"> PAGEREF _Toc243617018 \h </w:instrText>
+              <w:instrText xml:space="preserve"> PAGEREF _Toc243618607 \h </w:instrText>
             </w:r>
             <w:r>
               <w:rPr>
@@ -3471,7 +3471,7 @@
                 <w:noProof/>
                 <w:webHidden/>
               </w:rPr>
-              <w:t>40</w:t>
+              <w:t>41</w:t>
             </w:r>
             <w:r>
               <w:rPr>
@@ -3497,7 +3497,7 @@
               <w14:ligatures w14:val="standardContextual"/>
             </w:rPr>
           </w:pPr>
-          <w:hyperlink w:anchor="_Toc243617019" w:history="1">
+          <w:hyperlink w:anchor="_Toc243618608" w:history="1">
             <w:r>
               <w:rPr>
                 <w:rStyle w:val="Hipervnculo"/>
@@ -3524,7 +3524,7 @@
                 <w:noProof/>
                 <w:webHidden/>
               </w:rPr>
-              <w:instrText xml:space="preserve"> PAGEREF _Toc243617019 \h </w:instrText>
+              <w:instrText xml:space="preserve"> PAGEREF _Toc243618608 \h </w:instrText>
             </w:r>
             <w:r>
               <w:rPr>
@@ -3544,7 +3544,7 @@
                 <w:noProof/>
                 <w:webHidden/>
               </w:rPr>
-              <w:t>40</w:t>
+              <w:t>41</w:t>
             </w:r>
             <w:r>
               <w:rPr>
@@ -3568,7 +3568,7 @@
               <w14:ligatures w14:val="standardContextual"/>
             </w:rPr>
           </w:pPr>
-          <w:hyperlink w:anchor="_Toc243617020" w:history="1">
+          <w:hyperlink w:anchor="_Toc243618609" w:history="1">
             <w:r>
               <w:rPr>
                 <w:rStyle w:val="Hipervnculo"/>
@@ -3591,7 +3591,7 @@
               <w:rPr>
                 <w:webHidden/>
               </w:rPr>
-              <w:instrText xml:space="preserve"> PAGEREF _Toc243617020 \h </w:instrText>
+              <w:instrText xml:space="preserve"> PAGEREF _Toc243618609 \h </w:instrText>
             </w:r>
             <w:r>
               <w:rPr>
@@ -3608,7 +3608,7 @@
               <w:rPr>
                 <w:webHidden/>
               </w:rPr>
-              <w:t>41</w:t>
+              <w:t>42</w:t>
             </w:r>
             <w:r>
               <w:rPr>
@@ -3633,7 +3633,7 @@
               <w14:ligatures w14:val="standardContextual"/>
             </w:rPr>
           </w:pPr>
-          <w:hyperlink w:anchor="_Toc243617021" w:history="1">
+          <w:hyperlink w:anchor="_Toc243618610" w:history="1">
             <w:r>
               <w:rPr>
                 <w:rStyle w:val="Hipervnculo"/>
@@ -3660,7 +3660,7 @@
                 <w:noProof/>
                 <w:webHidden/>
               </w:rPr>
-              <w:instrText xml:space="preserve"> PAGEREF _Toc243617021 \h </w:instrText>
+              <w:instrText xml:space="preserve"> PAGEREF _Toc243618610 \h </w:instrText>
             </w:r>
             <w:r>
               <w:rPr>
@@ -3680,7 +3680,7 @@
                 <w:noProof/>
                 <w:webHidden/>
               </w:rPr>
-              <w:t>41</w:t>
+              <w:t>42</w:t>
             </w:r>
             <w:r>
               <w:rPr>
@@ -3706,7 +3706,7 @@
               <w14:ligatures w14:val="standardContextual"/>
             </w:rPr>
           </w:pPr>
-          <w:hyperlink w:anchor="_Toc243617022" w:history="1">
+          <w:hyperlink w:anchor="_Toc243618611" w:history="1">
             <w:r>
               <w:rPr>
                 <w:rStyle w:val="Hipervnculo"/>
@@ -3733,7 +3733,7 @@
                 <w:noProof/>
                 <w:webHidden/>
               </w:rPr>
-              <w:instrText xml:space="preserve"> PAGEREF _Toc243617022 \h </w:instrText>
+              <w:instrText xml:space="preserve"> PAGEREF _Toc243618611 \h </w:instrText>
             </w:r>
             <w:r>
               <w:rPr>
@@ -3753,7 +3753,7 @@
                 <w:noProof/>
                 <w:webHidden/>
               </w:rPr>
-              <w:t>42</w:t>
+              <w:t>43</w:t>
             </w:r>
             <w:r>
               <w:rPr>
@@ -3779,7 +3779,7 @@
               <w14:ligatures w14:val="standardContextual"/>
             </w:rPr>
           </w:pPr>
-          <w:hyperlink w:anchor="_Toc243617023" w:history="1">
+          <w:hyperlink w:anchor="_Toc243618612" w:history="1">
             <w:r>
               <w:rPr>
                 <w:rStyle w:val="Hipervnculo"/>
@@ -3806,7 +3806,7 @@
                 <w:noProof/>
                 <w:webHidden/>
               </w:rPr>
-              <w:instrText xml:space="preserve"> PAGEREF _Toc243617023 \h </w:instrText>
+              <w:instrText xml:space="preserve"> PAGEREF _Toc243618612 \h </w:instrText>
             </w:r>
             <w:r>
               <w:rPr>
@@ -3826,7 +3826,7 @@
                 <w:noProof/>
                 <w:webHidden/>
               </w:rPr>
-              <w:t>42</w:t>
+              <w:t>43</w:t>
             </w:r>
             <w:r>
               <w:rPr>
@@ -3852,7 +3852,7 @@
               <w14:ligatures w14:val="standardContextual"/>
             </w:rPr>
           </w:pPr>
-          <w:hyperlink w:anchor="_Toc243617024" w:history="1">
+          <w:hyperlink w:anchor="_Toc243618613" w:history="1">
             <w:r>
               <w:rPr>
                 <w:rStyle w:val="Hipervnculo"/>
@@ -3879,7 +3879,7 @@
                 <w:noProof/>
                 <w:webHidden/>
               </w:rPr>
-              <w:instrText xml:space="preserve"> PAGEREF _Toc243617024 \h </w:instrText>
+              <w:instrText xml:space="preserve"> PAGEREF _Toc243618613 \h </w:instrText>
             </w:r>
             <w:r>
               <w:rPr>
@@ -3899,7 +3899,7 @@
                 <w:noProof/>
                 <w:webHidden/>
               </w:rPr>
-              <w:t>42</w:t>
+              <w:t>43</w:t>
             </w:r>
             <w:r>
               <w:rPr>
@@ -3925,7 +3925,7 @@
               <w14:ligatures w14:val="standardContextual"/>
             </w:rPr>
           </w:pPr>
-          <w:hyperlink w:anchor="_Toc243617025" w:history="1">
+          <w:hyperlink w:anchor="_Toc243618614" w:history="1">
             <w:r>
               <w:rPr>
                 <w:rStyle w:val="Hipervnculo"/>
@@ -3952,7 +3952,7 @@
                 <w:noProof/>
                 <w:webHidden/>
               </w:rPr>
-              <w:instrText xml:space="preserve"> PAGEREF _Toc243617025 \h </w:instrText>
+              <w:instrText xml:space="preserve"> PAGEREF _Toc243618614 \h </w:instrText>
             </w:r>
             <w:r>
               <w:rPr>
@@ -3972,7 +3972,7 @@
                 <w:noProof/>
                 <w:webHidden/>
               </w:rPr>
-              <w:t>42</w:t>
+              <w:t>43</w:t>
             </w:r>
             <w:r>
               <w:rPr>
@@ -3996,7 +3996,7 @@
               <w14:ligatures w14:val="standardContextual"/>
             </w:rPr>
           </w:pPr>
-          <w:hyperlink w:anchor="_Toc243617026" w:history="1">
+          <w:hyperlink w:anchor="_Toc243618615" w:history="1">
             <w:r>
               <w:rPr>
                 <w:rStyle w:val="Hipervnculo"/>
@@ -4019,7 +4019,7 @@
               <w:rPr>
                 <w:webHidden/>
               </w:rPr>
-              <w:instrText xml:space="preserve"> PAGEREF _Toc243617026 \h </w:instrText>
+              <w:instrText xml:space="preserve"> PAGEREF _Toc243618615 \h </w:instrText>
             </w:r>
             <w:r>
               <w:rPr>
@@ -4036,7 +4036,7 @@
               <w:rPr>
                 <w:webHidden/>
               </w:rPr>
-              <w:t>43</w:t>
+              <w:t>44</w:t>
             </w:r>
             <w:r>
               <w:rPr>
@@ -4061,7 +4061,7 @@
               <w14:ligatures w14:val="standardContextual"/>
             </w:rPr>
           </w:pPr>
-          <w:hyperlink w:anchor="_Toc243617027" w:history="1">
+          <w:hyperlink w:anchor="_Toc243618616" w:history="1">
             <w:r>
               <w:rPr>
                 <w:rStyle w:val="Hipervnculo"/>
@@ -4088,7 +4088,7 @@
                 <w:noProof/>
                 <w:webHidden/>
               </w:rPr>
-              <w:instrText xml:space="preserve"> PAGEREF _Toc243617027 \h </w:instrText>
+              <w:instrText xml:space="preserve"> PAGEREF _Toc243618616 \h </w:instrText>
             </w:r>
             <w:r>
               <w:rPr>
@@ -4108,7 +4108,7 @@
                 <w:noProof/>
                 <w:webHidden/>
               </w:rPr>
-              <w:t>43</w:t>
+              <w:t>44</w:t>
             </w:r>
             <w:r>
               <w:rPr>
@@ -4134,7 +4134,7 @@
               <w14:ligatures w14:val="standardContextual"/>
             </w:rPr>
           </w:pPr>
-          <w:hyperlink w:anchor="_Toc243617028" w:history="1">
+          <w:hyperlink w:anchor="_Toc243618617" w:history="1">
             <w:r>
               <w:rPr>
                 <w:rStyle w:val="Hipervnculo"/>
@@ -4161,7 +4161,7 @@
                 <w:noProof/>
                 <w:webHidden/>
               </w:rPr>
-              <w:instrText xml:space="preserve"> PAGEREF _Toc243617028 \h </w:instrText>
+              <w:instrText xml:space="preserve"> PAGEREF _Toc243618617 \h </w:instrText>
             </w:r>
             <w:r>
               <w:rPr>
@@ -4181,7 +4181,7 @@
                 <w:noProof/>
                 <w:webHidden/>
               </w:rPr>
-              <w:t>43</w:t>
+              <w:t>44</w:t>
             </w:r>
             <w:r>
               <w:rPr>
@@ -4207,7 +4207,7 @@
               <w14:ligatures w14:val="standardContextual"/>
             </w:rPr>
           </w:pPr>
-          <w:hyperlink w:anchor="_Toc243617029" w:history="1">
+          <w:hyperlink w:anchor="_Toc243618618" w:history="1">
             <w:r>
               <w:rPr>
                 <w:rStyle w:val="Hipervnculo"/>
@@ -4234,7 +4234,7 @@
                 <w:noProof/>
                 <w:webHidden/>
               </w:rPr>
-              <w:instrText xml:space="preserve"> PAGEREF _Toc243617029 \h </w:instrText>
+              <w:instrText xml:space="preserve"> PAGEREF _Toc243618618 \h </w:instrText>
             </w:r>
             <w:r>
               <w:rPr>
@@ -4254,7 +4254,7 @@
                 <w:noProof/>
                 <w:webHidden/>
               </w:rPr>
-              <w:t>43</w:t>
+              <w:t>44</w:t>
             </w:r>
             <w:r>
               <w:rPr>
@@ -4280,7 +4280,7 @@
               <w14:ligatures w14:val="standardContextual"/>
             </w:rPr>
           </w:pPr>
-          <w:hyperlink w:anchor="_Toc243617030" w:history="1">
+          <w:hyperlink w:anchor="_Toc243618619" w:history="1">
             <w:r>
               <w:rPr>
                 <w:rStyle w:val="Hipervnculo"/>
@@ -4307,7 +4307,7 @@
                 <w:noProof/>
                 <w:webHidden/>
               </w:rPr>
-              <w:instrText xml:space="preserve"> PAGEREF _Toc243617030 \h </w:instrText>
+              <w:instrText xml:space="preserve"> PAGEREF _Toc243618619 \h </w:instrText>
             </w:r>
             <w:r>
               <w:rPr>
@@ -4327,7 +4327,7 @@
                 <w:noProof/>
                 <w:webHidden/>
               </w:rPr>
-              <w:t>43</w:t>
+              <w:t>44</w:t>
             </w:r>
             <w:r>
               <w:rPr>
@@ -4353,7 +4353,7 @@
               <w14:ligatures w14:val="standardContextual"/>
             </w:rPr>
           </w:pPr>
-          <w:hyperlink w:anchor="_Toc243617031" w:history="1">
+          <w:hyperlink w:anchor="_Toc243618620" w:history="1">
             <w:r>
               <w:rPr>
                 <w:rStyle w:val="Hipervnculo"/>
@@ -4380,7 +4380,7 @@
                 <w:noProof/>
                 <w:webHidden/>
               </w:rPr>
-              <w:instrText xml:space="preserve"> PAGEREF _Toc243617031 \h </w:instrText>
+              <w:instrText xml:space="preserve"> PAGEREF _Toc243618620 \h </w:instrText>
             </w:r>
             <w:r>
               <w:rPr>
@@ -4400,7 +4400,7 @@
                 <w:noProof/>
                 <w:webHidden/>
               </w:rPr>
-              <w:t>43</w:t>
+              <w:t>44</w:t>
             </w:r>
             <w:r>
               <w:rPr>
@@ -4426,7 +4426,7 @@
               <w14:ligatures w14:val="standardContextual"/>
             </w:rPr>
           </w:pPr>
-          <w:hyperlink w:anchor="_Toc243617032" w:history="1">
+          <w:hyperlink w:anchor="_Toc243618621" w:history="1">
             <w:r>
               <w:rPr>
                 <w:rStyle w:val="Hipervnculo"/>
@@ -4453,7 +4453,7 @@
                 <w:noProof/>
                 <w:webHidden/>
               </w:rPr>
-              <w:instrText xml:space="preserve"> PAGEREF _Toc243617032 \h </w:instrText>
+              <w:instrText xml:space="preserve"> PAGEREF _Toc243618621 \h </w:instrText>
             </w:r>
             <w:r>
               <w:rPr>
@@ -4473,7 +4473,7 @@
                 <w:noProof/>
                 <w:webHidden/>
               </w:rPr>
-              <w:t>43</w:t>
+              <w:t>44</w:t>
             </w:r>
             <w:r>
               <w:rPr>
@@ -4497,7 +4497,7 @@
               <w14:ligatures w14:val="standardContextual"/>
             </w:rPr>
           </w:pPr>
-          <w:hyperlink w:anchor="_Toc243617033" w:history="1">
+          <w:hyperlink w:anchor="_Toc243618622" w:history="1">
             <w:r>
               <w:rPr>
                 <w:rStyle w:val="Hipervnculo"/>
@@ -4520,7 +4520,7 @@
               <w:rPr>
                 <w:webHidden/>
               </w:rPr>
-              <w:instrText xml:space="preserve"> PAGEREF _Toc243617033 \h </w:instrText>
+              <w:instrText xml:space="preserve"> PAGEREF _Toc243618622 \h </w:instrText>
             </w:r>
             <w:r>
               <w:rPr>
@@ -4537,7 +4537,7 @@
               <w:rPr>
                 <w:webHidden/>
               </w:rPr>
-              <w:t>44</w:t>
+              <w:t>45</w:t>
             </w:r>
             <w:r>
               <w:rPr>
@@ -4562,7 +4562,7 @@
               <w14:ligatures w14:val="standardContextual"/>
             </w:rPr>
           </w:pPr>
-          <w:hyperlink w:anchor="_Toc243617034" w:history="1">
+          <w:hyperlink w:anchor="_Toc243618623" w:history="1">
             <w:r>
               <w:rPr>
                 <w:rStyle w:val="Hipervnculo"/>
@@ -4589,7 +4589,7 @@
                 <w:noProof/>
                 <w:webHidden/>
               </w:rPr>
-              <w:instrText xml:space="preserve"> PAGEREF _Toc243617034 \h </w:instrText>
+              <w:instrText xml:space="preserve"> PAGEREF _Toc243618623 \h </w:instrText>
             </w:r>
             <w:r>
               <w:rPr>
@@ -4609,7 +4609,7 @@
                 <w:noProof/>
                 <w:webHidden/>
               </w:rPr>
-              <w:t>44</w:t>
+              <w:t>45</w:t>
             </w:r>
             <w:r>
               <w:rPr>
@@ -4635,7 +4635,7 @@
               <w14:ligatures w14:val="standardContextual"/>
             </w:rPr>
           </w:pPr>
-          <w:hyperlink w:anchor="_Toc243617035" w:history="1">
+          <w:hyperlink w:anchor="_Toc243618624" w:history="1">
             <w:r>
               <w:rPr>
                 <w:rStyle w:val="Hipervnculo"/>
@@ -4662,7 +4662,7 @@
                 <w:noProof/>
                 <w:webHidden/>
               </w:rPr>
-              <w:instrText xml:space="preserve"> PAGEREF _Toc243617035 \h </w:instrText>
+              <w:instrText xml:space="preserve"> PAGEREF _Toc243618624 \h </w:instrText>
             </w:r>
             <w:r>
               <w:rPr>
@@ -4682,7 +4682,7 @@
                 <w:noProof/>
                 <w:webHidden/>
               </w:rPr>
-              <w:t>44</w:t>
+              <w:t>45</w:t>
             </w:r>
             <w:r>
               <w:rPr>
@@ -4706,7 +4706,7 @@
               <w14:ligatures w14:val="standardContextual"/>
             </w:rPr>
           </w:pPr>
-          <w:hyperlink w:anchor="_Toc243617036" w:history="1">
+          <w:hyperlink w:anchor="_Toc243618625" w:history="1">
             <w:r>
               <w:rPr>
                 <w:rStyle w:val="Hipervnculo"/>
@@ -4729,7 +4729,7 @@
               <w:rPr>
                 <w:webHidden/>
               </w:rPr>
-              <w:instrText xml:space="preserve"> PAGEREF _Toc243617036 \h </w:instrText>
+              <w:instrText xml:space="preserve"> PAGEREF _Toc243618625 \h </w:instrText>
             </w:r>
             <w:r>
               <w:rPr>
@@ -4746,7 +4746,7 @@
               <w:rPr>
                 <w:webHidden/>
               </w:rPr>
-              <w:t>45</w:t>
+              <w:t>46</w:t>
             </w:r>
             <w:r>
               <w:rPr>
@@ -4769,7 +4769,7 @@
               <w14:ligatures w14:val="standardContextual"/>
             </w:rPr>
           </w:pPr>
-          <w:hyperlink w:anchor="_Toc243617037" w:history="1">
+          <w:hyperlink w:anchor="_Toc243618626" w:history="1">
             <w:r>
               <w:rPr>
                 <w:rStyle w:val="Hipervnculo"/>
@@ -4792,7 +4792,7 @@
               <w:rPr>
                 <w:webHidden/>
               </w:rPr>
-              <w:instrText xml:space="preserve"> PAGEREF _Toc243617037 \h </w:instrText>
+              <w:instrText xml:space="preserve"> PAGEREF _Toc243618626 \h </w:instrText>
             </w:r>
             <w:r>
               <w:rPr>
@@ -4809,7 +4809,7 @@
               <w:rPr>
                 <w:webHidden/>
               </w:rPr>
-              <w:t>46</w:t>
+              <w:t>47</w:t>
             </w:r>
             <w:r>
               <w:rPr>
@@ -4834,7 +4834,7 @@
               <w14:ligatures w14:val="standardContextual"/>
             </w:rPr>
           </w:pPr>
-          <w:hyperlink w:anchor="_Toc243617038" w:history="1">
+          <w:hyperlink w:anchor="_Toc243618627" w:history="1">
             <w:r>
               <w:rPr>
                 <w:rStyle w:val="Hipervnculo"/>
@@ -4861,7 +4861,7 @@
                 <w:noProof/>
                 <w:webHidden/>
               </w:rPr>
-              <w:instrText xml:space="preserve"> PAGEREF _Toc243617038 \h </w:instrText>
+              <w:instrText xml:space="preserve"> PAGEREF _Toc243618627 \h </w:instrText>
             </w:r>
             <w:r>
               <w:rPr>
@@ -4881,7 +4881,7 @@
                 <w:noProof/>
                 <w:webHidden/>
               </w:rPr>
-              <w:t>46</w:t>
+              <w:t>47</w:t>
             </w:r>
             <w:r>
               <w:rPr>
@@ -4907,7 +4907,7 @@
               <w14:ligatures w14:val="standardContextual"/>
             </w:rPr>
           </w:pPr>
-          <w:hyperlink w:anchor="_Toc243617039" w:history="1">
+          <w:hyperlink w:anchor="_Toc243618628" w:history="1">
             <w:r>
               <w:rPr>
                 <w:rStyle w:val="Hipervnculo"/>
@@ -4934,7 +4934,7 @@
                 <w:noProof/>
                 <w:webHidden/>
               </w:rPr>
-              <w:instrText xml:space="preserve"> PAGEREF _Toc243617039 \h </w:instrText>
+              <w:instrText xml:space="preserve"> PAGEREF _Toc243618628 \h </w:instrText>
             </w:r>
             <w:r>
               <w:rPr>
@@ -4954,7 +4954,7 @@
                 <w:noProof/>
                 <w:webHidden/>
               </w:rPr>
-              <w:t>52</w:t>
+              <w:t>53</w:t>
             </w:r>
             <w:r>
               <w:rPr>
@@ -4988,7 +4988,7 @@
       <w:pPr>
         <w:pStyle w:val="CAPITULO"/>
       </w:pPr>
-      <w:bookmarkStart w:id="1" w:name="_Toc243616989"/>
+      <w:bookmarkStart w:id="1" w:name="_Toc243618578"/>
       <w:r>
         <w:t>CAPÍTULO I. ASPECTOS GENERALES</w:t>
       </w:r>
@@ -4998,7 +4998,7 @@
       <w:pPr>
         <w:pStyle w:val="Titulo11"/>
       </w:pPr>
-      <w:bookmarkStart w:id="2" w:name="_Toc243616990"/>
+      <w:bookmarkStart w:id="2" w:name="_Toc243618579"/>
       <w:r>
         <w:t>1.1. Introducción</w:t>
       </w:r>
@@ -5089,7 +5089,7 @@
       <w:pPr>
         <w:pStyle w:val="Titulo11"/>
       </w:pPr>
-      <w:bookmarkStart w:id="3" w:name="_Toc243616991"/>
+      <w:bookmarkStart w:id="3" w:name="_Toc243618580"/>
       <w:r>
         <w:t>1.2. Planteamiento del problema</w:t>
       </w:r>
@@ -5183,7 +5183,7 @@
       <w:pPr>
         <w:pStyle w:val="Titulo11"/>
       </w:pPr>
-      <w:bookmarkStart w:id="4" w:name="_Toc243616992"/>
+      <w:bookmarkStart w:id="4" w:name="_Toc243618581"/>
       <w:r>
         <w:t>1.3. Objetivos del proyecto</w:t>
       </w:r>
@@ -5193,7 +5193,7 @@
       <w:pPr>
         <w:pStyle w:val="Titulo2"/>
       </w:pPr>
-      <w:bookmarkStart w:id="5" w:name="_Toc243616993"/>
+      <w:bookmarkStart w:id="5" w:name="_Toc243618582"/>
       <w:r>
         <w:t>1.3.1. Objetivo general</w:t>
       </w:r>
@@ -5230,7 +5230,7 @@
       <w:pPr>
         <w:pStyle w:val="Titulo2"/>
       </w:pPr>
-      <w:bookmarkStart w:id="6" w:name="_Toc243616994"/>
+      <w:bookmarkStart w:id="6" w:name="_Toc243618583"/>
       <w:r>
         <w:t>1.3.2. Objetivos específicos</w:t>
       </w:r>
@@ -5464,7 +5464,7 @@
       <w:pPr>
         <w:pStyle w:val="Titulo11"/>
       </w:pPr>
-      <w:bookmarkStart w:id="7" w:name="_Toc243616995"/>
+      <w:bookmarkStart w:id="7" w:name="_Toc243618584"/>
       <w:r>
         <w:t>1.4. Justificación</w:t>
       </w:r>
@@ -5549,7 +5549,7 @@
       <w:pPr>
         <w:pStyle w:val="Titulo11"/>
       </w:pPr>
-      <w:bookmarkStart w:id="8" w:name="_Toc243616996"/>
+      <w:bookmarkStart w:id="8" w:name="_Toc243618585"/>
       <w:r>
         <w:t>1.5. Alcance y limitaciones</w:t>
       </w:r>
@@ -5559,7 +5559,7 @@
       <w:pPr>
         <w:pStyle w:val="Titulo2"/>
       </w:pPr>
-      <w:bookmarkStart w:id="9" w:name="_Toc243616997"/>
+      <w:bookmarkStart w:id="9" w:name="_Toc243618586"/>
       <w:r>
         <w:t>1.5.1. Alcance</w:t>
       </w:r>
@@ -5736,7 +5736,7 @@
         <w:t>Módulo 11 — Aportes propios.</w:t>
       </w:r>
       <w:r>
-        <w:t xml:space="preserve"> Traspasos entre sucursales por pedido, sugeridos por las prendas más vendidas; un probador virtual que dibuja la prenda con sus medidas reales y sugiere la talla; la contratación de un plan desde la web; la marca de cada empresa en su tienda; la cuenta única del cliente; y la exportación de los datos de la empresa.</w:t>
+        <w:t xml:space="preserve"> Traspasos entre sucursales por pedido, sugeridos por las prendas más vendidas; un probador virtual que dibuja la prenda con sus medidas reales y sugiere la talla; la contratación de un plan desde la web; la marca de cada empresa en su tienda; la cuenta única del cliente; la exportación de los datos de la empresa; y las copias de seguridad con su restauración, cuya frecuencia depende del plan.</w:t>
       </w:r>
     </w:p>
     <w:p>
@@ -5758,7 +5758,7 @@
       <w:pPr>
         <w:pStyle w:val="Titulo2"/>
       </w:pPr>
-      <w:bookmarkStart w:id="10" w:name="_Toc243616998"/>
+      <w:bookmarkStart w:id="10" w:name="_Toc243618587"/>
       <w:r>
         <w:t>1.5.2. Limitaciones</w:t>
       </w:r>
@@ -5866,7 +5866,7 @@
       <w:pPr>
         <w:pStyle w:val="Titulo11"/>
       </w:pPr>
-      <w:bookmarkStart w:id="11" w:name="_Toc243616999"/>
+      <w:bookmarkStart w:id="11" w:name="_Toc243618588"/>
       <w:r>
         <w:t>1.6. Metodología de desarrollo ICONIX</w:t>
       </w:r>
@@ -6392,7 +6392,7 @@
               <w:rPr>
                 <w:sz w:val="22"/>
               </w:rPr>
-              <w:t>CU-27 a CU-39: reportes con IA y voz; analítica con ML; ofertas y precios mayoristas; traspasos y probador por talla; exportación de datos</w:t>
+              <w:t>CU-27 a CU-40: reportes con IA y voz; analítica con ML; ofertas y precios mayoristas; traspasos y probador por talla; exportación de datos y copias de seguridad</w:t>
             </w:r>
           </w:p>
         </w:tc>
@@ -6504,7 +6504,7 @@
       <w:pPr>
         <w:pStyle w:val="CAPITULO"/>
       </w:pPr>
-      <w:bookmarkStart w:id="12" w:name="_Toc243617000"/>
+      <w:bookmarkStart w:id="12" w:name="_Toc243618589"/>
       <w:r>
         <w:t>CAPÍTULO II. ANÁLISIS DE REQUISITOS</w:t>
       </w:r>
@@ -6514,7 +6514,7 @@
       <w:pPr>
         <w:pStyle w:val="Titulo11"/>
       </w:pPr>
-      <w:bookmarkStart w:id="13" w:name="_Toc243617001"/>
+      <w:bookmarkStart w:id="13" w:name="_Toc243618590"/>
       <w:r>
         <w:t>2.1. Descripción del sistema propuesto</w:t>
       </w:r>
@@ -7024,7 +7024,7 @@
       <w:pPr>
         <w:pStyle w:val="Titulo2"/>
       </w:pPr>
-      <w:bookmarkStart w:id="14" w:name="_Toc243617002"/>
+      <w:bookmarkStart w:id="14" w:name="_Toc243618591"/>
       <w:r>
         <w:t>2.1.1. Planes de suscripción</w:t>
       </w:r>
@@ -10368,6 +10368,387 @@
               <w:right w:val="single" w:sz="6" w:space="0" w:color="D1D9E0"/>
             </w:tcBorders>
             <w:shd w:val="clear" w:color="auto" w:fill="FFFFFF"/>
+            <w:tcMar>
+              <w:top w:w="90" w:type="dxa"/>
+              <w:left w:w="195" w:type="dxa"/>
+              <w:bottom w:w="90" w:type="dxa"/>
+              <w:right w:w="195" w:type="dxa"/>
+            </w:tcMar>
+            <w:vAlign w:val="center"/>
+          </w:tcPr>
+          <w:p>
+            <w:pPr>
+              <w:spacing w:line="276" w:lineRule="auto"/>
+              <w:ind w:firstLine="0"/>
+            </w:pPr>
+            <w:r>
+              <w:rPr>
+                <w:sz w:val="22"/>
+              </w:rPr>
+              <w:t>Sí</w:t>
+            </w:r>
+          </w:p>
+        </w:tc>
+      </w:tr>
+      <w:tr>
+        <w:tc>
+          <w:tcPr>
+            <w:tcW w:w="4082" w:type="dxa"/>
+            <w:tcBorders>
+              <w:top w:val="single" w:sz="6" w:space="0" w:color="D1D9E0"/>
+              <w:left w:val="single" w:sz="6" w:space="0" w:color="D1D9E0"/>
+              <w:bottom w:val="single" w:sz="6" w:space="0" w:color="D1D9E0"/>
+              <w:right w:val="single" w:sz="6" w:space="0" w:color="D1D9E0"/>
+            </w:tcBorders>
+            <w:shd w:val="clear" w:color="auto" w:fill="F6F8FA"/>
+            <w:tcMar>
+              <w:top w:w="90" w:type="dxa"/>
+              <w:left w:w="195" w:type="dxa"/>
+              <w:bottom w:w="90" w:type="dxa"/>
+              <w:right w:w="195" w:type="dxa"/>
+            </w:tcMar>
+            <w:vAlign w:val="center"/>
+          </w:tcPr>
+          <w:p>
+            <w:pPr>
+              <w:spacing w:line="276" w:lineRule="auto"/>
+              <w:ind w:firstLine="0"/>
+            </w:pPr>
+            <w:r>
+              <w:rPr>
+                <w:b/>
+                <w:sz w:val="22"/>
+              </w:rPr>
+              <w:t>Copias de seguridad manuales (propio)</w:t>
+            </w:r>
+          </w:p>
+        </w:tc>
+        <w:tc>
+          <w:tcPr>
+            <w:tcW w:w="1900" w:type="dxa"/>
+            <w:tcBorders>
+              <w:top w:val="single" w:sz="6" w:space="0" w:color="D1D9E0"/>
+              <w:left w:val="single" w:sz="6" w:space="0" w:color="D1D9E0"/>
+              <w:bottom w:val="single" w:sz="6" w:space="0" w:color="D1D9E0"/>
+              <w:right w:val="single" w:sz="6" w:space="0" w:color="D1D9E0"/>
+            </w:tcBorders>
+            <w:shd w:val="clear" w:color="auto" w:fill="F6F8FA"/>
+            <w:tcMar>
+              <w:top w:w="90" w:type="dxa"/>
+              <w:left w:w="195" w:type="dxa"/>
+              <w:bottom w:w="90" w:type="dxa"/>
+              <w:right w:w="195" w:type="dxa"/>
+            </w:tcMar>
+            <w:vAlign w:val="center"/>
+          </w:tcPr>
+          <w:p>
+            <w:pPr>
+              <w:spacing w:line="276" w:lineRule="auto"/>
+              <w:ind w:firstLine="0"/>
+            </w:pPr>
+            <w:r>
+              <w:rPr>
+                <w:sz w:val="22"/>
+              </w:rPr>
+              <w:t>Una por semana</w:t>
+            </w:r>
+          </w:p>
+        </w:tc>
+        <w:tc>
+          <w:tcPr>
+            <w:tcW w:w="1900" w:type="dxa"/>
+            <w:tcBorders>
+              <w:top w:val="single" w:sz="6" w:space="0" w:color="D1D9E0"/>
+              <w:left w:val="single" w:sz="6" w:space="0" w:color="D1D9E0"/>
+              <w:bottom w:val="single" w:sz="6" w:space="0" w:color="D1D9E0"/>
+              <w:right w:val="single" w:sz="6" w:space="0" w:color="D1D9E0"/>
+            </w:tcBorders>
+            <w:shd w:val="clear" w:color="auto" w:fill="F6F8FA"/>
+            <w:tcMar>
+              <w:top w:w="90" w:type="dxa"/>
+              <w:left w:w="195" w:type="dxa"/>
+              <w:bottom w:w="90" w:type="dxa"/>
+              <w:right w:w="195" w:type="dxa"/>
+            </w:tcMar>
+            <w:vAlign w:val="center"/>
+          </w:tcPr>
+          <w:p>
+            <w:pPr>
+              <w:spacing w:line="276" w:lineRule="auto"/>
+              <w:ind w:firstLine="0"/>
+            </w:pPr>
+            <w:r>
+              <w:rPr>
+                <w:sz w:val="22"/>
+              </w:rPr>
+              <w:t>Una por día</w:t>
+            </w:r>
+          </w:p>
+        </w:tc>
+        <w:tc>
+          <w:tcPr>
+            <w:tcW w:w="1900" w:type="dxa"/>
+            <w:tcBorders>
+              <w:top w:val="single" w:sz="6" w:space="0" w:color="D1D9E0"/>
+              <w:left w:val="single" w:sz="6" w:space="0" w:color="D1D9E0"/>
+              <w:bottom w:val="single" w:sz="6" w:space="0" w:color="D1D9E0"/>
+              <w:right w:val="single" w:sz="6" w:space="0" w:color="D1D9E0"/>
+            </w:tcBorders>
+            <w:shd w:val="clear" w:color="auto" w:fill="F6F8FA"/>
+            <w:tcMar>
+              <w:top w:w="90" w:type="dxa"/>
+              <w:left w:w="195" w:type="dxa"/>
+              <w:bottom w:w="90" w:type="dxa"/>
+              <w:right w:w="195" w:type="dxa"/>
+            </w:tcMar>
+            <w:vAlign w:val="center"/>
+          </w:tcPr>
+          <w:p>
+            <w:pPr>
+              <w:spacing w:line="276" w:lineRule="auto"/>
+              <w:ind w:firstLine="0"/>
+            </w:pPr>
+            <w:r>
+              <w:rPr>
+                <w:sz w:val="22"/>
+              </w:rPr>
+              <w:t>A voluntad</w:t>
+            </w:r>
+          </w:p>
+        </w:tc>
+      </w:tr>
+      <w:tr>
+        <w:tc>
+          <w:tcPr>
+            <w:tcW w:w="4082" w:type="dxa"/>
+            <w:tcBorders>
+              <w:top w:val="single" w:sz="6" w:space="0" w:color="D1D9E0"/>
+              <w:left w:val="single" w:sz="6" w:space="0" w:color="D1D9E0"/>
+              <w:bottom w:val="single" w:sz="6" w:space="0" w:color="D1D9E0"/>
+              <w:right w:val="single" w:sz="6" w:space="0" w:color="D1D9E0"/>
+            </w:tcBorders>
+            <w:shd w:val="clear" w:color="auto" w:fill="FFFFFF"/>
+            <w:tcMar>
+              <w:top w:w="90" w:type="dxa"/>
+              <w:left w:w="195" w:type="dxa"/>
+              <w:bottom w:w="90" w:type="dxa"/>
+              <w:right w:w="195" w:type="dxa"/>
+            </w:tcMar>
+            <w:vAlign w:val="center"/>
+          </w:tcPr>
+          <w:p>
+            <w:pPr>
+              <w:spacing w:line="276" w:lineRule="auto"/>
+              <w:ind w:firstLine="0"/>
+            </w:pPr>
+            <w:r>
+              <w:rPr>
+                <w:b/>
+                <w:sz w:val="22"/>
+              </w:rPr>
+              <w:t>Copias automáticas cifradas (propio)</w:t>
+            </w:r>
+          </w:p>
+        </w:tc>
+        <w:tc>
+          <w:tcPr>
+            <w:tcW w:w="1900" w:type="dxa"/>
+            <w:tcBorders>
+              <w:top w:val="single" w:sz="6" w:space="0" w:color="D1D9E0"/>
+              <w:left w:val="single" w:sz="6" w:space="0" w:color="D1D9E0"/>
+              <w:bottom w:val="single" w:sz="6" w:space="0" w:color="D1D9E0"/>
+              <w:right w:val="single" w:sz="6" w:space="0" w:color="D1D9E0"/>
+            </w:tcBorders>
+            <w:shd w:val="clear" w:color="auto" w:fill="FFFFFF"/>
+            <w:tcMar>
+              <w:top w:w="90" w:type="dxa"/>
+              <w:left w:w="195" w:type="dxa"/>
+              <w:bottom w:w="90" w:type="dxa"/>
+              <w:right w:w="195" w:type="dxa"/>
+            </w:tcMar>
+            <w:vAlign w:val="center"/>
+          </w:tcPr>
+          <w:p>
+            <w:pPr>
+              <w:spacing w:line="276" w:lineRule="auto"/>
+              <w:ind w:firstLine="0"/>
+            </w:pPr>
+            <w:r>
+              <w:rPr>
+                <w:sz w:val="22"/>
+              </w:rPr>
+              <w:t>Semanal, conserva 4</w:t>
+            </w:r>
+          </w:p>
+        </w:tc>
+        <w:tc>
+          <w:tcPr>
+            <w:tcW w:w="1900" w:type="dxa"/>
+            <w:tcBorders>
+              <w:top w:val="single" w:sz="6" w:space="0" w:color="D1D9E0"/>
+              <w:left w:val="single" w:sz="6" w:space="0" w:color="D1D9E0"/>
+              <w:bottom w:val="single" w:sz="6" w:space="0" w:color="D1D9E0"/>
+              <w:right w:val="single" w:sz="6" w:space="0" w:color="D1D9E0"/>
+            </w:tcBorders>
+            <w:shd w:val="clear" w:color="auto" w:fill="FFFFFF"/>
+            <w:tcMar>
+              <w:top w:w="90" w:type="dxa"/>
+              <w:left w:w="195" w:type="dxa"/>
+              <w:bottom w:w="90" w:type="dxa"/>
+              <w:right w:w="195" w:type="dxa"/>
+            </w:tcMar>
+            <w:vAlign w:val="center"/>
+          </w:tcPr>
+          <w:p>
+            <w:pPr>
+              <w:spacing w:line="276" w:lineRule="auto"/>
+              <w:ind w:firstLine="0"/>
+            </w:pPr>
+            <w:r>
+              <w:rPr>
+                <w:sz w:val="22"/>
+              </w:rPr>
+              <w:t>Diaria, conserva 7</w:t>
+            </w:r>
+          </w:p>
+        </w:tc>
+        <w:tc>
+          <w:tcPr>
+            <w:tcW w:w="1900" w:type="dxa"/>
+            <w:tcBorders>
+              <w:top w:val="single" w:sz="6" w:space="0" w:color="D1D9E0"/>
+              <w:left w:val="single" w:sz="6" w:space="0" w:color="D1D9E0"/>
+              <w:bottom w:val="single" w:sz="6" w:space="0" w:color="D1D9E0"/>
+              <w:right w:val="single" w:sz="6" w:space="0" w:color="D1D9E0"/>
+            </w:tcBorders>
+            <w:shd w:val="clear" w:color="auto" w:fill="FFFFFF"/>
+            <w:tcMar>
+              <w:top w:w="90" w:type="dxa"/>
+              <w:left w:w="195" w:type="dxa"/>
+              <w:bottom w:w="90" w:type="dxa"/>
+              <w:right w:w="195" w:type="dxa"/>
+            </w:tcMar>
+            <w:vAlign w:val="center"/>
+          </w:tcPr>
+          <w:p>
+            <w:pPr>
+              <w:spacing w:line="276" w:lineRule="auto"/>
+              <w:ind w:firstLine="0"/>
+            </w:pPr>
+            <w:r>
+              <w:rPr>
+                <w:sz w:val="22"/>
+              </w:rPr>
+              <w:t>Diaria, conserva 30</w:t>
+            </w:r>
+          </w:p>
+        </w:tc>
+      </w:tr>
+      <w:tr>
+        <w:tc>
+          <w:tcPr>
+            <w:tcW w:w="4082" w:type="dxa"/>
+            <w:tcBorders>
+              <w:top w:val="single" w:sz="6" w:space="0" w:color="D1D9E0"/>
+              <w:left w:val="single" w:sz="6" w:space="0" w:color="D1D9E0"/>
+              <w:bottom w:val="single" w:sz="6" w:space="0" w:color="D1D9E0"/>
+              <w:right w:val="single" w:sz="6" w:space="0" w:color="D1D9E0"/>
+            </w:tcBorders>
+            <w:shd w:val="clear" w:color="auto" w:fill="F6F8FA"/>
+            <w:tcMar>
+              <w:top w:w="90" w:type="dxa"/>
+              <w:left w:w="195" w:type="dxa"/>
+              <w:bottom w:w="90" w:type="dxa"/>
+              <w:right w:w="195" w:type="dxa"/>
+            </w:tcMar>
+            <w:vAlign w:val="center"/>
+          </w:tcPr>
+          <w:p>
+            <w:pPr>
+              <w:spacing w:line="276" w:lineRule="auto"/>
+              <w:ind w:firstLine="0"/>
+            </w:pPr>
+            <w:r>
+              <w:rPr>
+                <w:b/>
+                <w:sz w:val="22"/>
+              </w:rPr>
+              <w:t>Restaurar la empresa desde una copia (propio)</w:t>
+            </w:r>
+          </w:p>
+        </w:tc>
+        <w:tc>
+          <w:tcPr>
+            <w:tcW w:w="1900" w:type="dxa"/>
+            <w:tcBorders>
+              <w:top w:val="single" w:sz="6" w:space="0" w:color="D1D9E0"/>
+              <w:left w:val="single" w:sz="6" w:space="0" w:color="D1D9E0"/>
+              <w:bottom w:val="single" w:sz="6" w:space="0" w:color="D1D9E0"/>
+              <w:right w:val="single" w:sz="6" w:space="0" w:color="D1D9E0"/>
+            </w:tcBorders>
+            <w:shd w:val="clear" w:color="auto" w:fill="F6F8FA"/>
+            <w:tcMar>
+              <w:top w:w="90" w:type="dxa"/>
+              <w:left w:w="195" w:type="dxa"/>
+              <w:bottom w:w="90" w:type="dxa"/>
+              <w:right w:w="195" w:type="dxa"/>
+            </w:tcMar>
+            <w:vAlign w:val="center"/>
+          </w:tcPr>
+          <w:p>
+            <w:pPr>
+              <w:spacing w:line="276" w:lineRule="auto"/>
+              <w:ind w:firstLine="0"/>
+            </w:pPr>
+            <w:r>
+              <w:rPr>
+                <w:sz w:val="22"/>
+              </w:rPr>
+              <w:t>Sí</w:t>
+            </w:r>
+          </w:p>
+        </w:tc>
+        <w:tc>
+          <w:tcPr>
+            <w:tcW w:w="1900" w:type="dxa"/>
+            <w:tcBorders>
+              <w:top w:val="single" w:sz="6" w:space="0" w:color="D1D9E0"/>
+              <w:left w:val="single" w:sz="6" w:space="0" w:color="D1D9E0"/>
+              <w:bottom w:val="single" w:sz="6" w:space="0" w:color="D1D9E0"/>
+              <w:right w:val="single" w:sz="6" w:space="0" w:color="D1D9E0"/>
+            </w:tcBorders>
+            <w:shd w:val="clear" w:color="auto" w:fill="F6F8FA"/>
+            <w:tcMar>
+              <w:top w:w="90" w:type="dxa"/>
+              <w:left w:w="195" w:type="dxa"/>
+              <w:bottom w:w="90" w:type="dxa"/>
+              <w:right w:w="195" w:type="dxa"/>
+            </w:tcMar>
+            <w:vAlign w:val="center"/>
+          </w:tcPr>
+          <w:p>
+            <w:pPr>
+              <w:spacing w:line="276" w:lineRule="auto"/>
+              <w:ind w:firstLine="0"/>
+            </w:pPr>
+            <w:r>
+              <w:rPr>
+                <w:sz w:val="22"/>
+              </w:rPr>
+              <w:t>Sí</w:t>
+            </w:r>
+          </w:p>
+        </w:tc>
+        <w:tc>
+          <w:tcPr>
+            <w:tcW w:w="1900" w:type="dxa"/>
+            <w:tcBorders>
+              <w:top w:val="single" w:sz="6" w:space="0" w:color="D1D9E0"/>
+              <w:left w:val="single" w:sz="6" w:space="0" w:color="D1D9E0"/>
+              <w:bottom w:val="single" w:sz="6" w:space="0" w:color="D1D9E0"/>
+              <w:right w:val="single" w:sz="6" w:space="0" w:color="D1D9E0"/>
+            </w:tcBorders>
+            <w:shd w:val="clear" w:color="auto" w:fill="F6F8FA"/>
             <w:tcMar>
               <w:top w:w="90" w:type="dxa"/>
               <w:left w:w="195" w:type="dxa"/>
@@ -10464,7 +10845,7 @@
       <w:pPr>
         <w:pStyle w:val="Titulo11"/>
       </w:pPr>
-      <w:bookmarkStart w:id="15" w:name="_Toc243617003"/>
+      <w:bookmarkStart w:id="15" w:name="_Toc243618592"/>
       <w:r>
         <w:t>2.2. Identificación de actores</w:t>
       </w:r>
@@ -11795,7 +12176,7 @@
       <w:pPr>
         <w:pStyle w:val="Titulo11"/>
       </w:pPr>
-      <w:bookmarkStart w:id="16" w:name="_Toc243617004"/>
+      <w:bookmarkStart w:id="16" w:name="_Toc243618593"/>
       <w:r>
         <w:t>2.3. Requisitos funcionales y no funcionales</w:t>
       </w:r>
@@ -11805,7 +12186,7 @@
       <w:pPr>
         <w:pStyle w:val="Titulo2"/>
       </w:pPr>
-      <w:bookmarkStart w:id="17" w:name="_Toc243617005"/>
+      <w:bookmarkStart w:id="17" w:name="_Toc243618594"/>
       <w:r>
         <w:t>2.3.1. Requisitos funcionales del enunciado</w:t>
       </w:r>
@@ -15617,7 +15998,7 @@
       <w:pPr>
         <w:pStyle w:val="Titulo2"/>
       </w:pPr>
-      <w:bookmarkStart w:id="18" w:name="_Toc243617006"/>
+      <w:bookmarkStart w:id="18" w:name="_Toc243618595"/>
       <w:r>
         <w:t>2.3.2. Requisitos funcionales pedidos en clase</w:t>
       </w:r>
@@ -16936,7 +17317,7 @@
       <w:pPr>
         <w:pStyle w:val="Titulo2"/>
       </w:pPr>
-      <w:bookmarkStart w:id="19" w:name="_Toc243617007"/>
+      <w:bookmarkStart w:id="19" w:name="_Toc243618596"/>
       <w:r>
         <w:t>2.3.3. Requisitos funcionales propios</w:t>
       </w:r>
@@ -16948,7 +17329,7 @@
         <w:jc w:val="both"/>
       </w:pPr>
       <w:r>
-        <w:t>El enunciado pide «otras funcionalidades como aporte propio» (sección 7.2). El grupo propone 13 requisitos en tres frentes.</w:t>
+        <w:t>El enunciado pide «otras funcionalidades como aporte propio» (sección 7.2). El grupo propone 17 requisitos en cuatro frentes.</w:t>
       </w:r>
     </w:p>
     <w:p>
@@ -17435,6 +17816,366 @@
                 <w:sz w:val="22"/>
               </w:rPr>
               <w:t>Que un cliente use una sola cuenta para comprar en las tiendas de varias empresas</w:t>
+            </w:r>
+          </w:p>
+        </w:tc>
+      </w:tr>
+    </w:tbl>
+    <w:p/>
+    <w:p>
+      <w:pPr>
+        <w:pStyle w:val="Titulo3"/>
+      </w:pPr>
+      <w:r>
+        <w:t>Copias de seguridad</w:t>
+      </w:r>
+    </w:p>
+    <w:p>
+      <w:pPr>
+        <w:spacing w:line="276" w:lineRule="auto"/>
+        <w:jc w:val="both"/>
+      </w:pPr>
+      <w:r>
+        <w:t>Toda empresa que confía sus datos a un SaaS necesita poder recuperarlos. La copia es lógica, en JSON y solo con los datos de la empresa, de modo que se abre con cualquier herramienta y se puede revisar. No reemplaza a la exportación a Excel del RF-48, que es para leer los datos, no para restaurarlos.</w:t>
+      </w:r>
+    </w:p>
+    <w:tbl>
+      <w:tblPr>
+        <w:tblW w:w="9782" w:type="dxa"/>
+        <w:tblInd w:w="-434" w:type="dxa"/>
+        <w:tblLook w:val="04A0" w:firstRow="1" w:lastRow="0" w:firstColumn="1" w:lastColumn="0" w:noHBand="0" w:noVBand="1"/>
+      </w:tblPr>
+      <w:tblGrid>
+        <w:gridCol w:w="1100"/>
+        <w:gridCol w:w="8682"/>
+      </w:tblGrid>
+      <w:tr>
+        <w:trPr>
+          <w:tblHeader/>
+        </w:trPr>
+        <w:tc>
+          <w:tcPr>
+            <w:tcW w:w="1100" w:type="dxa"/>
+            <w:tcBorders>
+              <w:top w:val="single" w:sz="6" w:space="0" w:color="D1D9E0"/>
+              <w:left w:val="single" w:sz="6" w:space="0" w:color="D1D9E0"/>
+              <w:bottom w:val="single" w:sz="6" w:space="0" w:color="D1D9E0"/>
+              <w:right w:val="single" w:sz="6" w:space="0" w:color="D1D9E0"/>
+            </w:tcBorders>
+            <w:shd w:val="clear" w:color="auto" w:fill="FFFFFF"/>
+            <w:tcMar>
+              <w:top w:w="90" w:type="dxa"/>
+              <w:left w:w="195" w:type="dxa"/>
+              <w:bottom w:w="90" w:type="dxa"/>
+              <w:right w:w="195" w:type="dxa"/>
+            </w:tcMar>
+            <w:vAlign w:val="center"/>
+          </w:tcPr>
+          <w:p>
+            <w:pPr>
+              <w:spacing w:line="276" w:lineRule="auto"/>
+              <w:ind w:firstLine="0"/>
+            </w:pPr>
+            <w:r>
+              <w:rPr>
+                <w:b/>
+                <w:color w:val="EE0000"/>
+                <w:sz w:val="22"/>
+              </w:rPr>
+              <w:t>RF</w:t>
+            </w:r>
+          </w:p>
+        </w:tc>
+        <w:tc>
+          <w:tcPr>
+            <w:tcW w:w="8682" w:type="dxa"/>
+            <w:tcBorders>
+              <w:top w:val="single" w:sz="6" w:space="0" w:color="D1D9E0"/>
+              <w:left w:val="single" w:sz="6" w:space="0" w:color="D1D9E0"/>
+              <w:bottom w:val="single" w:sz="6" w:space="0" w:color="D1D9E0"/>
+              <w:right w:val="single" w:sz="6" w:space="0" w:color="D1D9E0"/>
+            </w:tcBorders>
+            <w:shd w:val="clear" w:color="auto" w:fill="FFFFFF"/>
+            <w:tcMar>
+              <w:top w:w="90" w:type="dxa"/>
+              <w:left w:w="195" w:type="dxa"/>
+              <w:bottom w:w="90" w:type="dxa"/>
+              <w:right w:w="195" w:type="dxa"/>
+            </w:tcMar>
+            <w:vAlign w:val="center"/>
+          </w:tcPr>
+          <w:p>
+            <w:pPr>
+              <w:spacing w:line="276" w:lineRule="auto"/>
+              <w:ind w:firstLine="0"/>
+            </w:pPr>
+            <w:r>
+              <w:rPr>
+                <w:b/>
+                <w:color w:val="EE0000"/>
+                <w:sz w:val="22"/>
+              </w:rPr>
+              <w:t>El sistema deberá permitir…</w:t>
+            </w:r>
+          </w:p>
+        </w:tc>
+      </w:tr>
+      <w:tr>
+        <w:tc>
+          <w:tcPr>
+            <w:tcW w:w="1100" w:type="dxa"/>
+            <w:tcBorders>
+              <w:top w:val="single" w:sz="6" w:space="0" w:color="D1D9E0"/>
+              <w:left w:val="single" w:sz="6" w:space="0" w:color="D1D9E0"/>
+              <w:bottom w:val="single" w:sz="6" w:space="0" w:color="D1D9E0"/>
+              <w:right w:val="single" w:sz="6" w:space="0" w:color="D1D9E0"/>
+            </w:tcBorders>
+            <w:shd w:val="clear" w:color="auto" w:fill="FFFFFF"/>
+            <w:tcMar>
+              <w:top w:w="90" w:type="dxa"/>
+              <w:left w:w="195" w:type="dxa"/>
+              <w:bottom w:w="90" w:type="dxa"/>
+              <w:right w:w="195" w:type="dxa"/>
+            </w:tcMar>
+            <w:vAlign w:val="center"/>
+          </w:tcPr>
+          <w:p>
+            <w:pPr>
+              <w:spacing w:line="276" w:lineRule="auto"/>
+              <w:ind w:firstLine="0"/>
+            </w:pPr>
+            <w:r>
+              <w:rPr>
+                <w:b/>
+                <w:sz w:val="22"/>
+              </w:rPr>
+              <w:t>RF-60</w:t>
+            </w:r>
+          </w:p>
+        </w:tc>
+        <w:tc>
+          <w:tcPr>
+            <w:tcW w:w="8682" w:type="dxa"/>
+            <w:tcBorders>
+              <w:top w:val="single" w:sz="6" w:space="0" w:color="D1D9E0"/>
+              <w:left w:val="single" w:sz="6" w:space="0" w:color="D1D9E0"/>
+              <w:bottom w:val="single" w:sz="6" w:space="0" w:color="D1D9E0"/>
+              <w:right w:val="single" w:sz="6" w:space="0" w:color="D1D9E0"/>
+            </w:tcBorders>
+            <w:shd w:val="clear" w:color="auto" w:fill="FFFFFF"/>
+            <w:tcMar>
+              <w:top w:w="90" w:type="dxa"/>
+              <w:left w:w="195" w:type="dxa"/>
+              <w:bottom w:w="90" w:type="dxa"/>
+              <w:right w:w="195" w:type="dxa"/>
+            </w:tcMar>
+            <w:vAlign w:val="center"/>
+          </w:tcPr>
+          <w:p>
+            <w:pPr>
+              <w:spacing w:line="276" w:lineRule="auto"/>
+              <w:ind w:firstLine="0"/>
+            </w:pPr>
+            <w:r>
+              <w:rPr>
+                <w:sz w:val="22"/>
+              </w:rPr>
+              <w:t>Que el administrador de la empresa genere una copia de seguridad de todos los datos de su empresa y la descargue, con la frecuencia que permite su plan</w:t>
+            </w:r>
+          </w:p>
+        </w:tc>
+      </w:tr>
+      <w:tr>
+        <w:tc>
+          <w:tcPr>
+            <w:tcW w:w="1100" w:type="dxa"/>
+            <w:tcBorders>
+              <w:top w:val="single" w:sz="6" w:space="0" w:color="D1D9E0"/>
+              <w:left w:val="single" w:sz="6" w:space="0" w:color="D1D9E0"/>
+              <w:bottom w:val="single" w:sz="6" w:space="0" w:color="D1D9E0"/>
+              <w:right w:val="single" w:sz="6" w:space="0" w:color="D1D9E0"/>
+            </w:tcBorders>
+            <w:shd w:val="clear" w:color="auto" w:fill="F6F8FA"/>
+            <w:tcMar>
+              <w:top w:w="90" w:type="dxa"/>
+              <w:left w:w="195" w:type="dxa"/>
+              <w:bottom w:w="90" w:type="dxa"/>
+              <w:right w:w="195" w:type="dxa"/>
+            </w:tcMar>
+            <w:vAlign w:val="center"/>
+          </w:tcPr>
+          <w:p>
+            <w:pPr>
+              <w:spacing w:line="276" w:lineRule="auto"/>
+              <w:ind w:firstLine="0"/>
+            </w:pPr>
+            <w:r>
+              <w:rPr>
+                <w:b/>
+                <w:sz w:val="22"/>
+              </w:rPr>
+              <w:t>RF-61</w:t>
+            </w:r>
+          </w:p>
+        </w:tc>
+        <w:tc>
+          <w:tcPr>
+            <w:tcW w:w="8682" w:type="dxa"/>
+            <w:tcBorders>
+              <w:top w:val="single" w:sz="6" w:space="0" w:color="D1D9E0"/>
+              <w:left w:val="single" w:sz="6" w:space="0" w:color="D1D9E0"/>
+              <w:bottom w:val="single" w:sz="6" w:space="0" w:color="D1D9E0"/>
+              <w:right w:val="single" w:sz="6" w:space="0" w:color="D1D9E0"/>
+            </w:tcBorders>
+            <w:shd w:val="clear" w:color="auto" w:fill="F6F8FA"/>
+            <w:tcMar>
+              <w:top w:w="90" w:type="dxa"/>
+              <w:left w:w="195" w:type="dxa"/>
+              <w:bottom w:w="90" w:type="dxa"/>
+              <w:right w:w="195" w:type="dxa"/>
+            </w:tcMar>
+            <w:vAlign w:val="center"/>
+          </w:tcPr>
+          <w:p>
+            <w:pPr>
+              <w:spacing w:line="276" w:lineRule="auto"/>
+              <w:ind w:firstLine="0"/>
+            </w:pPr>
+            <w:r>
+              <w:rPr>
+                <w:sz w:val="22"/>
+              </w:rPr>
+              <w:t>Generar copias automáticas de cada empresa con la frecuencia de su plan, guardarlas cifradas y conservar solo las últimas que el plan indica</w:t>
+            </w:r>
+          </w:p>
+        </w:tc>
+      </w:tr>
+      <w:tr>
+        <w:tc>
+          <w:tcPr>
+            <w:tcW w:w="1100" w:type="dxa"/>
+            <w:tcBorders>
+              <w:top w:val="single" w:sz="6" w:space="0" w:color="D1D9E0"/>
+              <w:left w:val="single" w:sz="6" w:space="0" w:color="D1D9E0"/>
+              <w:bottom w:val="single" w:sz="6" w:space="0" w:color="D1D9E0"/>
+              <w:right w:val="single" w:sz="6" w:space="0" w:color="D1D9E0"/>
+            </w:tcBorders>
+            <w:shd w:val="clear" w:color="auto" w:fill="FFFFFF"/>
+            <w:tcMar>
+              <w:top w:w="90" w:type="dxa"/>
+              <w:left w:w="195" w:type="dxa"/>
+              <w:bottom w:w="90" w:type="dxa"/>
+              <w:right w:w="195" w:type="dxa"/>
+            </w:tcMar>
+            <w:vAlign w:val="center"/>
+          </w:tcPr>
+          <w:p>
+            <w:pPr>
+              <w:spacing w:line="276" w:lineRule="auto"/>
+              <w:ind w:firstLine="0"/>
+            </w:pPr>
+            <w:r>
+              <w:rPr>
+                <w:b/>
+                <w:sz w:val="22"/>
+              </w:rPr>
+              <w:t>RF-62</w:t>
+            </w:r>
+          </w:p>
+        </w:tc>
+        <w:tc>
+          <w:tcPr>
+            <w:tcW w:w="8682" w:type="dxa"/>
+            <w:tcBorders>
+              <w:top w:val="single" w:sz="6" w:space="0" w:color="D1D9E0"/>
+              <w:left w:val="single" w:sz="6" w:space="0" w:color="D1D9E0"/>
+              <w:bottom w:val="single" w:sz="6" w:space="0" w:color="D1D9E0"/>
+              <w:right w:val="single" w:sz="6" w:space="0" w:color="D1D9E0"/>
+            </w:tcBorders>
+            <w:shd w:val="clear" w:color="auto" w:fill="FFFFFF"/>
+            <w:tcMar>
+              <w:top w:w="90" w:type="dxa"/>
+              <w:left w:w="195" w:type="dxa"/>
+              <w:bottom w:w="90" w:type="dxa"/>
+              <w:right w:w="195" w:type="dxa"/>
+            </w:tcMar>
+            <w:vAlign w:val="center"/>
+          </w:tcPr>
+          <w:p>
+            <w:pPr>
+              <w:spacing w:line="276" w:lineRule="auto"/>
+              <w:ind w:firstLine="0"/>
+            </w:pPr>
+            <w:r>
+              <w:rPr>
+                <w:sz w:val="22"/>
+              </w:rPr>
+              <w:t>Restaurar la empresa desde una copia, reemplazando sus datos en una sola transacción, después de verificar que el archivo sea de esa empresa y no esté alterado</w:t>
+            </w:r>
+          </w:p>
+        </w:tc>
+      </w:tr>
+      <w:tr>
+        <w:tc>
+          <w:tcPr>
+            <w:tcW w:w="1100" w:type="dxa"/>
+            <w:tcBorders>
+              <w:top w:val="single" w:sz="6" w:space="0" w:color="D1D9E0"/>
+              <w:left w:val="single" w:sz="6" w:space="0" w:color="D1D9E0"/>
+              <w:bottom w:val="single" w:sz="6" w:space="0" w:color="D1D9E0"/>
+              <w:right w:val="single" w:sz="6" w:space="0" w:color="D1D9E0"/>
+            </w:tcBorders>
+            <w:shd w:val="clear" w:color="auto" w:fill="F6F8FA"/>
+            <w:tcMar>
+              <w:top w:w="90" w:type="dxa"/>
+              <w:left w:w="195" w:type="dxa"/>
+              <w:bottom w:w="90" w:type="dxa"/>
+              <w:right w:w="195" w:type="dxa"/>
+            </w:tcMar>
+            <w:vAlign w:val="center"/>
+          </w:tcPr>
+          <w:p>
+            <w:pPr>
+              <w:spacing w:line="276" w:lineRule="auto"/>
+              <w:ind w:firstLine="0"/>
+            </w:pPr>
+            <w:r>
+              <w:rPr>
+                <w:b/>
+                <w:sz w:val="22"/>
+              </w:rPr>
+              <w:t>RF-63</w:t>
+            </w:r>
+          </w:p>
+        </w:tc>
+        <w:tc>
+          <w:tcPr>
+            <w:tcW w:w="8682" w:type="dxa"/>
+            <w:tcBorders>
+              <w:top w:val="single" w:sz="6" w:space="0" w:color="D1D9E0"/>
+              <w:left w:val="single" w:sz="6" w:space="0" w:color="D1D9E0"/>
+              <w:bottom w:val="single" w:sz="6" w:space="0" w:color="D1D9E0"/>
+              <w:right w:val="single" w:sz="6" w:space="0" w:color="D1D9E0"/>
+            </w:tcBorders>
+            <w:shd w:val="clear" w:color="auto" w:fill="F6F8FA"/>
+            <w:tcMar>
+              <w:top w:w="90" w:type="dxa"/>
+              <w:left w:w="195" w:type="dxa"/>
+              <w:bottom w:w="90" w:type="dxa"/>
+              <w:right w:w="195" w:type="dxa"/>
+            </w:tcMar>
+            <w:vAlign w:val="center"/>
+          </w:tcPr>
+          <w:p>
+            <w:pPr>
+              <w:spacing w:line="276" w:lineRule="auto"/>
+              <w:ind w:firstLine="0"/>
+            </w:pPr>
+            <w:r>
+              <w:rPr>
+                <w:sz w:val="22"/>
+              </w:rPr>
+              <w:t>Consultar el historial de copias y restauraciones: cuándo, quién, tamaño y filas por tabla</w:t>
             </w:r>
           </w:p>
         </w:tc>
@@ -18109,7 +18850,7 @@
       <w:pPr>
         <w:pStyle w:val="Titulo2"/>
       </w:pPr>
-      <w:bookmarkStart w:id="20" w:name="_Toc243617008"/>
+      <w:bookmarkStart w:id="20" w:name="_Toc243618597"/>
       <w:r>
         <w:t>2.3.4. Requisitos no funcionales</w:t>
       </w:r>
@@ -19775,13 +20516,109 @@
           </w:p>
         </w:tc>
       </w:tr>
+      <w:tr>
+        <w:tc>
+          <w:tcPr>
+            <w:tcW w:w="1000" w:type="dxa"/>
+            <w:tcBorders>
+              <w:top w:val="single" w:sz="6" w:space="0" w:color="D1D9E0"/>
+              <w:left w:val="single" w:sz="6" w:space="0" w:color="D1D9E0"/>
+              <w:bottom w:val="single" w:sz="6" w:space="0" w:color="D1D9E0"/>
+              <w:right w:val="single" w:sz="6" w:space="0" w:color="D1D9E0"/>
+            </w:tcBorders>
+            <w:shd w:val="clear" w:color="auto" w:fill="FFFFFF"/>
+            <w:tcMar>
+              <w:top w:w="90" w:type="dxa"/>
+              <w:left w:w="195" w:type="dxa"/>
+              <w:bottom w:w="90" w:type="dxa"/>
+              <w:right w:w="195" w:type="dxa"/>
+            </w:tcMar>
+            <w:vAlign w:val="center"/>
+          </w:tcPr>
+          <w:p>
+            <w:pPr>
+              <w:spacing w:line="276" w:lineRule="auto"/>
+              <w:ind w:firstLine="0"/>
+            </w:pPr>
+            <w:r>
+              <w:rPr>
+                <w:b/>
+                <w:sz w:val="22"/>
+              </w:rPr>
+              <w:t>RNF17</w:t>
+            </w:r>
+          </w:p>
+        </w:tc>
+        <w:tc>
+          <w:tcPr>
+            <w:tcW w:w="2500" w:type="dxa"/>
+            <w:tcBorders>
+              <w:top w:val="single" w:sz="6" w:space="0" w:color="D1D9E0"/>
+              <w:left w:val="single" w:sz="6" w:space="0" w:color="D1D9E0"/>
+              <w:bottom w:val="single" w:sz="6" w:space="0" w:color="D1D9E0"/>
+              <w:right w:val="single" w:sz="6" w:space="0" w:color="D1D9E0"/>
+            </w:tcBorders>
+            <w:shd w:val="clear" w:color="auto" w:fill="FFFFFF"/>
+            <w:tcMar>
+              <w:top w:w="90" w:type="dxa"/>
+              <w:left w:w="195" w:type="dxa"/>
+              <w:bottom w:w="90" w:type="dxa"/>
+              <w:right w:w="195" w:type="dxa"/>
+            </w:tcMar>
+            <w:vAlign w:val="center"/>
+          </w:tcPr>
+          <w:p>
+            <w:pPr>
+              <w:spacing w:line="276" w:lineRule="auto"/>
+              <w:ind w:firstLine="0"/>
+            </w:pPr>
+            <w:r>
+              <w:rPr>
+                <w:sz w:val="22"/>
+              </w:rPr>
+              <w:t>Seguridad de las copias (propio)</w:t>
+            </w:r>
+          </w:p>
+        </w:tc>
+        <w:tc>
+          <w:tcPr>
+            <w:tcW w:w="6282" w:type="dxa"/>
+            <w:tcBorders>
+              <w:top w:val="single" w:sz="6" w:space="0" w:color="D1D9E0"/>
+              <w:left w:val="single" w:sz="6" w:space="0" w:color="D1D9E0"/>
+              <w:bottom w:val="single" w:sz="6" w:space="0" w:color="D1D9E0"/>
+              <w:right w:val="single" w:sz="6" w:space="0" w:color="D1D9E0"/>
+            </w:tcBorders>
+            <w:shd w:val="clear" w:color="auto" w:fill="FFFFFF"/>
+            <w:tcMar>
+              <w:top w:w="90" w:type="dxa"/>
+              <w:left w:w="195" w:type="dxa"/>
+              <w:bottom w:w="90" w:type="dxa"/>
+              <w:right w:w="195" w:type="dxa"/>
+            </w:tcMar>
+            <w:vAlign w:val="center"/>
+          </w:tcPr>
+          <w:p>
+            <w:pPr>
+              <w:spacing w:line="276" w:lineRule="auto"/>
+              <w:ind w:firstLine="0"/>
+            </w:pPr>
+            <w:r>
+              <w:rPr>
+                <w:sz w:val="22"/>
+              </w:rPr>
+              <w:t>Las copias manuales se descargan y no quedan en el servidor; las automáticas se guardan cifradas y con RLS. Cada copia lleva su SHA-256 para detectar un archivo alterado</w:t>
+            </w:r>
+          </w:p>
+        </w:tc>
+      </w:tr>
     </w:tbl>
     <w:p/>
     <w:p>
       <w:pPr>
         <w:pStyle w:val="Titulo11"/>
       </w:pPr>
-      <w:bookmarkStart w:id="21" w:name="_Toc243617009"/>
+      <w:bookmarkStart w:id="21" w:name="_Toc243618598"/>
       <w:r>
         <w:t>2.4. Reglas de negocio</w:t>
       </w:r>
@@ -20982,13 +21819,143 @@
           </w:p>
         </w:tc>
       </w:tr>
+      <w:tr>
+        <w:tc>
+          <w:tcPr>
+            <w:tcW w:w="1100" w:type="dxa"/>
+            <w:tcBorders>
+              <w:top w:val="single" w:sz="6" w:space="0" w:color="D1D9E0"/>
+              <w:left w:val="single" w:sz="6" w:space="0" w:color="D1D9E0"/>
+              <w:bottom w:val="single" w:sz="6" w:space="0" w:color="D1D9E0"/>
+              <w:right w:val="single" w:sz="6" w:space="0" w:color="D1D9E0"/>
+            </w:tcBorders>
+            <w:shd w:val="clear" w:color="auto" w:fill="F6F8FA"/>
+            <w:tcMar>
+              <w:top w:w="90" w:type="dxa"/>
+              <w:left w:w="195" w:type="dxa"/>
+              <w:bottom w:w="90" w:type="dxa"/>
+              <w:right w:w="195" w:type="dxa"/>
+            </w:tcMar>
+            <w:vAlign w:val="center"/>
+          </w:tcPr>
+          <w:p>
+            <w:pPr>
+              <w:spacing w:line="276" w:lineRule="auto"/>
+              <w:ind w:firstLine="0"/>
+            </w:pPr>
+            <w:r>
+              <w:rPr>
+                <w:b/>
+                <w:sz w:val="22"/>
+              </w:rPr>
+              <w:t>RN-18</w:t>
+            </w:r>
+          </w:p>
+        </w:tc>
+        <w:tc>
+          <w:tcPr>
+            <w:tcW w:w="8682" w:type="dxa"/>
+            <w:tcBorders>
+              <w:top w:val="single" w:sz="6" w:space="0" w:color="D1D9E0"/>
+              <w:left w:val="single" w:sz="6" w:space="0" w:color="D1D9E0"/>
+              <w:bottom w:val="single" w:sz="6" w:space="0" w:color="D1D9E0"/>
+              <w:right w:val="single" w:sz="6" w:space="0" w:color="D1D9E0"/>
+            </w:tcBorders>
+            <w:shd w:val="clear" w:color="auto" w:fill="F6F8FA"/>
+            <w:tcMar>
+              <w:top w:w="90" w:type="dxa"/>
+              <w:left w:w="195" w:type="dxa"/>
+              <w:bottom w:w="90" w:type="dxa"/>
+              <w:right w:w="195" w:type="dxa"/>
+            </w:tcMar>
+            <w:vAlign w:val="center"/>
+          </w:tcPr>
+          <w:p>
+            <w:pPr>
+              <w:spacing w:line="276" w:lineRule="auto"/>
+              <w:ind w:firstLine="0"/>
+            </w:pPr>
+            <w:r>
+              <w:rPr>
+                <w:sz w:val="22"/>
+              </w:rPr>
+              <w:t>El plan limita cuántas copias manuales se generan, nunca la restauración: recuperarse de un problema no depende de cuánto paga la empresa. Las copias automáticas no gastan la cuota de las manuales</w:t>
+            </w:r>
+          </w:p>
+        </w:tc>
+      </w:tr>
+      <w:tr>
+        <w:tc>
+          <w:tcPr>
+            <w:tcW w:w="1100" w:type="dxa"/>
+            <w:tcBorders>
+              <w:top w:val="single" w:sz="6" w:space="0" w:color="D1D9E0"/>
+              <w:left w:val="single" w:sz="6" w:space="0" w:color="D1D9E0"/>
+              <w:bottom w:val="single" w:sz="6" w:space="0" w:color="D1D9E0"/>
+              <w:right w:val="single" w:sz="6" w:space="0" w:color="D1D9E0"/>
+            </w:tcBorders>
+            <w:shd w:val="clear" w:color="auto" w:fill="FFFFFF"/>
+            <w:tcMar>
+              <w:top w:w="90" w:type="dxa"/>
+              <w:left w:w="195" w:type="dxa"/>
+              <w:bottom w:w="90" w:type="dxa"/>
+              <w:right w:w="195" w:type="dxa"/>
+            </w:tcMar>
+            <w:vAlign w:val="center"/>
+          </w:tcPr>
+          <w:p>
+            <w:pPr>
+              <w:spacing w:line="276" w:lineRule="auto"/>
+              <w:ind w:firstLine="0"/>
+            </w:pPr>
+            <w:r>
+              <w:rPr>
+                <w:b/>
+                <w:sz w:val="22"/>
+              </w:rPr>
+              <w:t>RN-19</w:t>
+            </w:r>
+          </w:p>
+        </w:tc>
+        <w:tc>
+          <w:tcPr>
+            <w:tcW w:w="8682" w:type="dxa"/>
+            <w:tcBorders>
+              <w:top w:val="single" w:sz="6" w:space="0" w:color="D1D9E0"/>
+              <w:left w:val="single" w:sz="6" w:space="0" w:color="D1D9E0"/>
+              <w:bottom w:val="single" w:sz="6" w:space="0" w:color="D1D9E0"/>
+              <w:right w:val="single" w:sz="6" w:space="0" w:color="D1D9E0"/>
+            </w:tcBorders>
+            <w:shd w:val="clear" w:color="auto" w:fill="FFFFFF"/>
+            <w:tcMar>
+              <w:top w:w="90" w:type="dxa"/>
+              <w:left w:w="195" w:type="dxa"/>
+              <w:bottom w:w="90" w:type="dxa"/>
+              <w:right w:w="195" w:type="dxa"/>
+            </w:tcMar>
+            <w:vAlign w:val="center"/>
+          </w:tcPr>
+          <w:p>
+            <w:pPr>
+              <w:spacing w:line="276" w:lineRule="auto"/>
+              <w:ind w:firstLine="0"/>
+            </w:pPr>
+            <w:r>
+              <w:rPr>
+                <w:sz w:val="22"/>
+              </w:rPr>
+              <w:t>Una restauración reemplaza todos los datos de la empresa; no los mezcla con los actuales. Solo la hace el administrador de la empresa, con un archivo de su propia empresa, y queda en la bitácora con quién, cuándo y de qué archivo</w:t>
+            </w:r>
+          </w:p>
+        </w:tc>
+      </w:tr>
     </w:tbl>
     <w:p/>
     <w:p>
       <w:pPr>
         <w:pStyle w:val="Titulo11"/>
       </w:pPr>
-      <w:bookmarkStart w:id="22" w:name="_Toc243617010"/>
+      <w:bookmarkStart w:id="22" w:name="_Toc243618599"/>
       <w:r>
         <w:t>2.5. Diagrama UML de casos de uso</w:t>
       </w:r>
@@ -21000,7 +21967,7 @@
         <w:jc w:val="both"/>
       </w:pPr>
       <w:r>
-        <w:t>Son 39 casos de uso, numerados desde el CU-01. Los del primer parcial que no se rehacen se listan en el Anexo 1, junto con su diagrama, y se citan como «CU-NN del primer parcial». Los que tienen algo en la columna Reemplaza vuelven a especificarse y a modelarse completos, porque el multitenant, los planes o el modo offline cambian su flujo. Los marcados como propios son aporte del grupo. La columna Plataforma indica si el caso de uso se usa en la web, en el móvil o en ambos; los del backend no tienen pantalla propia.</w:t>
+        <w:t>Son 40 casos de uso, numerados desde el CU-01. Los del primer parcial que no se rehacen se listan en el Anexo 1, junto con su diagrama, y se citan como «CU-NN del primer parcial». Los que tienen algo en la columna Reemplaza vuelven a especificarse y a modelarse completos, porque el multitenant, los planes o el modo offline cambian su flujo. Los marcados como propios son aporte del grupo. La columna Plataforma indica si el caso de uso se usa en la web, en el móvil o en ambos; los del backend no tienen pantalla propia.</w:t>
       </w:r>
     </w:p>
     <w:p>
@@ -21009,7 +21976,7 @@
         <w:jc w:val="both"/>
       </w:pPr>
       <w:r>
-        <w:t>Todos los RF, del RF-01 al RF-59, quedan asociados a por lo menos un caso de uso. Los casos de uso que el plan controla incluyen al CU-05, que verifica la función y el límite antes de continuar.</w:t>
+        <w:t>Todos los RF, del RF-01 al RF-63, quedan asociados a por lo menos un caso de uso. Los casos de uso que el plan controla incluyen al CU-05, que verifica la función y el límite antes de continuar.</w:t>
       </w:r>
     </w:p>
     <w:tbl>
@@ -28596,6 +29563,195 @@
                 <w:sz w:val="22"/>
               </w:rPr>
               <w:t>RF-48</w:t>
+            </w:r>
+          </w:p>
+        </w:tc>
+      </w:tr>
+      <w:tr>
+        <w:tc>
+          <w:tcPr>
+            <w:tcW w:w="1150" w:type="dxa"/>
+            <w:tcBorders>
+              <w:top w:val="single" w:sz="6" w:space="0" w:color="D1D9E0"/>
+              <w:left w:val="single" w:sz="6" w:space="0" w:color="D1D9E0"/>
+              <w:bottom w:val="single" w:sz="6" w:space="0" w:color="D1D9E0"/>
+              <w:right w:val="single" w:sz="6" w:space="0" w:color="D1D9E0"/>
+            </w:tcBorders>
+            <w:shd w:val="clear" w:color="auto" w:fill="F6F8FA"/>
+            <w:tcMar>
+              <w:top w:w="90" w:type="dxa"/>
+              <w:left w:w="195" w:type="dxa"/>
+              <w:bottom w:w="90" w:type="dxa"/>
+              <w:right w:w="195" w:type="dxa"/>
+            </w:tcMar>
+            <w:vAlign w:val="center"/>
+          </w:tcPr>
+          <w:p>
+            <w:pPr>
+              <w:spacing w:line="276" w:lineRule="auto"/>
+              <w:ind w:firstLine="0"/>
+            </w:pPr>
+            <w:r>
+              <w:rPr>
+                <w:b/>
+                <w:sz w:val="22"/>
+              </w:rPr>
+              <w:t>CU-40</w:t>
+            </w:r>
+          </w:p>
+        </w:tc>
+        <w:tc>
+          <w:tcPr>
+            <w:tcW w:w="2632" w:type="dxa"/>
+            <w:tcBorders>
+              <w:top w:val="single" w:sz="6" w:space="0" w:color="D1D9E0"/>
+              <w:left w:val="single" w:sz="6" w:space="0" w:color="D1D9E0"/>
+              <w:bottom w:val="single" w:sz="6" w:space="0" w:color="D1D9E0"/>
+              <w:right w:val="single" w:sz="6" w:space="0" w:color="D1D9E0"/>
+            </w:tcBorders>
+            <w:shd w:val="clear" w:color="auto" w:fill="F6F8FA"/>
+            <w:tcMar>
+              <w:top w:w="90" w:type="dxa"/>
+              <w:left w:w="195" w:type="dxa"/>
+              <w:bottom w:w="90" w:type="dxa"/>
+              <w:right w:w="195" w:type="dxa"/>
+            </w:tcMar>
+            <w:vAlign w:val="center"/>
+          </w:tcPr>
+          <w:p>
+            <w:pPr>
+              <w:spacing w:line="276" w:lineRule="auto"/>
+              <w:ind w:firstLine="0"/>
+            </w:pPr>
+            <w:r>
+              <w:rPr>
+                <w:sz w:val="22"/>
+              </w:rPr>
+              <w:t>Gestionar copias de seguridad de la empresa (propio)</w:t>
+            </w:r>
+          </w:p>
+        </w:tc>
+        <w:tc>
+          <w:tcPr>
+            <w:tcW w:w="1900" w:type="dxa"/>
+            <w:tcBorders>
+              <w:top w:val="single" w:sz="6" w:space="0" w:color="D1D9E0"/>
+              <w:left w:val="single" w:sz="6" w:space="0" w:color="D1D9E0"/>
+              <w:bottom w:val="single" w:sz="6" w:space="0" w:color="D1D9E0"/>
+              <w:right w:val="single" w:sz="6" w:space="0" w:color="D1D9E0"/>
+            </w:tcBorders>
+            <w:shd w:val="clear" w:color="auto" w:fill="F6F8FA"/>
+            <w:tcMar>
+              <w:top w:w="90" w:type="dxa"/>
+              <w:left w:w="195" w:type="dxa"/>
+              <w:bottom w:w="90" w:type="dxa"/>
+              <w:right w:w="195" w:type="dxa"/>
+            </w:tcMar>
+            <w:vAlign w:val="center"/>
+          </w:tcPr>
+          <w:p>
+            <w:pPr>
+              <w:spacing w:line="276" w:lineRule="auto"/>
+              <w:ind w:firstLine="0"/>
+            </w:pPr>
+            <w:r>
+              <w:rPr>
+                <w:sz w:val="22"/>
+              </w:rPr>
+              <w:t>Administrador de la empresa</w:t>
+            </w:r>
+          </w:p>
+        </w:tc>
+        <w:tc>
+          <w:tcPr>
+            <w:tcW w:w="1200" w:type="dxa"/>
+            <w:tcBorders>
+              <w:top w:val="single" w:sz="6" w:space="0" w:color="D1D9E0"/>
+              <w:left w:val="single" w:sz="6" w:space="0" w:color="D1D9E0"/>
+              <w:bottom w:val="single" w:sz="6" w:space="0" w:color="D1D9E0"/>
+              <w:right w:val="single" w:sz="6" w:space="0" w:color="D1D9E0"/>
+            </w:tcBorders>
+            <w:shd w:val="clear" w:color="auto" w:fill="F6F8FA"/>
+            <w:tcMar>
+              <w:top w:w="90" w:type="dxa"/>
+              <w:left w:w="195" w:type="dxa"/>
+              <w:bottom w:w="90" w:type="dxa"/>
+              <w:right w:w="195" w:type="dxa"/>
+            </w:tcMar>
+            <w:vAlign w:val="center"/>
+          </w:tcPr>
+          <w:p>
+            <w:pPr>
+              <w:spacing w:line="276" w:lineRule="auto"/>
+              <w:ind w:firstLine="0"/>
+            </w:pPr>
+            <w:r>
+              <w:rPr>
+                <w:sz w:val="22"/>
+              </w:rPr>
+              <w:t>Web</w:t>
+            </w:r>
+          </w:p>
+        </w:tc>
+        <w:tc>
+          <w:tcPr>
+            <w:tcW w:w="1500" w:type="dxa"/>
+            <w:tcBorders>
+              <w:top w:val="single" w:sz="6" w:space="0" w:color="D1D9E0"/>
+              <w:left w:val="single" w:sz="6" w:space="0" w:color="D1D9E0"/>
+              <w:bottom w:val="single" w:sz="6" w:space="0" w:color="D1D9E0"/>
+              <w:right w:val="single" w:sz="6" w:space="0" w:color="D1D9E0"/>
+            </w:tcBorders>
+            <w:shd w:val="clear" w:color="auto" w:fill="F6F8FA"/>
+            <w:tcMar>
+              <w:top w:w="90" w:type="dxa"/>
+              <w:left w:w="195" w:type="dxa"/>
+              <w:bottom w:w="90" w:type="dxa"/>
+              <w:right w:w="195" w:type="dxa"/>
+            </w:tcMar>
+            <w:vAlign w:val="center"/>
+          </w:tcPr>
+          <w:p>
+            <w:pPr>
+              <w:spacing w:line="276" w:lineRule="auto"/>
+              <w:ind w:firstLine="0"/>
+            </w:pPr>
+            <w:r>
+              <w:rPr>
+                <w:sz w:val="22"/>
+              </w:rPr>
+              <w:t>—</w:t>
+            </w:r>
+          </w:p>
+        </w:tc>
+        <w:tc>
+          <w:tcPr>
+            <w:tcW w:w="1400" w:type="dxa"/>
+            <w:tcBorders>
+              <w:top w:val="single" w:sz="6" w:space="0" w:color="D1D9E0"/>
+              <w:left w:val="single" w:sz="6" w:space="0" w:color="D1D9E0"/>
+              <w:bottom w:val="single" w:sz="6" w:space="0" w:color="D1D9E0"/>
+              <w:right w:val="single" w:sz="6" w:space="0" w:color="D1D9E0"/>
+            </w:tcBorders>
+            <w:shd w:val="clear" w:color="auto" w:fill="F6F8FA"/>
+            <w:tcMar>
+              <w:top w:w="90" w:type="dxa"/>
+              <w:left w:w="195" w:type="dxa"/>
+              <w:bottom w:w="90" w:type="dxa"/>
+              <w:right w:w="195" w:type="dxa"/>
+            </w:tcMar>
+            <w:vAlign w:val="center"/>
+          </w:tcPr>
+          <w:p>
+            <w:pPr>
+              <w:spacing w:line="276" w:lineRule="auto"/>
+              <w:ind w:firstLine="0"/>
+            </w:pPr>
+            <w:r>
+              <w:rPr>
+                <w:sz w:val="22"/>
+              </w:rPr>
+              <w:t>RF-60 a RF-63</w:t>
             </w:r>
           </w:p>
         </w:tc>
@@ -28634,7 +29790,7 @@
       <w:pPr>
         <w:pStyle w:val="Titulo11"/>
       </w:pPr>
-      <w:bookmarkStart w:id="23" w:name="_Toc243617011"/>
+      <w:bookmarkStart w:id="23" w:name="_Toc243618600"/>
       <w:r>
         <w:t>2.6. Especificación de casos de uso</w:t>
       </w:r>
@@ -36628,7 +37784,7 @@
       <w:pPr>
         <w:pStyle w:val="Titulo2"/>
       </w:pPr>
-      <w:bookmarkStart w:id="24" w:name="_Toc243617012"/>
+      <w:bookmarkStart w:id="24" w:name="_Toc243618601"/>
       <w:r>
         <w:t>PARA SIGUIENTES PRESENTACIONES</w:t>
       </w:r>
@@ -36852,6 +38008,14 @@
       </w:r>
     </w:p>
     <w:p>
+      <w:pPr>
+        <w:pStyle w:val="Titulo3"/>
+      </w:pPr>
+      <w:r>
+        <w:t>CU-40 — Gestionar copias de seguridad de la empresa</w:t>
+      </w:r>
+    </w:p>
+    <w:p>
       <w:r>
         <w:br w:type="page"/>
       </w:r>
@@ -36860,7 +38024,7 @@
       <w:pPr>
         <w:pStyle w:val="CAPITULO"/>
       </w:pPr>
-      <w:bookmarkStart w:id="25" w:name="_Toc243617013"/>
+      <w:bookmarkStart w:id="25" w:name="_Toc243618602"/>
       <w:r>
         <w:t>CAPÍTULO III. ANÁLISIS Y DISEÑO CON ICONIX</w:t>
       </w:r>
@@ -36870,7 +38034,7 @@
       <w:pPr>
         <w:pStyle w:val="Titulo11"/>
       </w:pPr>
-      <w:bookmarkStart w:id="26" w:name="_Toc243617014"/>
+      <w:bookmarkStart w:id="26" w:name="_Toc243618603"/>
       <w:r>
         <w:t>3.1. Modelo de dominio</w:t>
       </w:r>
@@ -36908,7 +38072,7 @@
       <w:pPr>
         <w:pStyle w:val="Titulo11"/>
       </w:pPr>
-      <w:bookmarkStart w:id="27" w:name="_Toc243617015"/>
+      <w:bookmarkStart w:id="27" w:name="_Toc243618604"/>
       <w:r>
         <w:t>3.2. Diagramas de robustez</w:t>
       </w:r>
@@ -36931,7 +38095,7 @@
           <w:noProof/>
         </w:rPr>
         <w:drawing>
-          <wp:inline distT="0" distB="0" distL="0" distR="0" wp14:anchorId="3E922337" wp14:editId="6BD24828">
+          <wp:inline distT="0" distB="0" distL="0" distR="0" wp14:anchorId="3E922337" wp14:editId="4F96BE37">
             <wp:extent cx="5612130" cy="5109845"/>
             <wp:effectExtent l="0" t="0" r="7620" b="0"/>
             <wp:docPr id="1773628163" name="Imagen 6"/>
@@ -37199,7 +38363,7 @@
           <w:noProof/>
         </w:rPr>
         <w:drawing>
-          <wp:inline distT="0" distB="0" distL="0" distR="0" wp14:anchorId="19ED1E35" wp14:editId="5A403230">
+          <wp:inline distT="0" distB="0" distL="0" distR="0" wp14:anchorId="19ED1E35" wp14:editId="28DD5F1E">
             <wp:extent cx="5612130" cy="2937510"/>
             <wp:effectExtent l="0" t="0" r="7620" b="0"/>
             <wp:docPr id="2017223192" name="Imagen 5"/>
@@ -37442,7 +38606,7 @@
           <w:u w:val="single"/>
         </w:rPr>
         <w:drawing>
-          <wp:inline distT="0" distB="0" distL="0" distR="0" wp14:anchorId="631F2AB3" wp14:editId="66C6232C">
+          <wp:inline distT="0" distB="0" distL="0" distR="0" wp14:anchorId="631F2AB3" wp14:editId="3E539DE6">
             <wp:extent cx="5669280" cy="4204171"/>
             <wp:effectExtent l="0" t="0" r="7620" b="6350"/>
             <wp:docPr id="1712863733" name="Imagen 4"/>
@@ -37799,7 +38963,7 @@
       <w:pPr>
         <w:pStyle w:val="Titulo11"/>
       </w:pPr>
-      <w:bookmarkStart w:id="28" w:name="_Toc243617016"/>
+      <w:bookmarkStart w:id="28" w:name="_Toc243618605"/>
       <w:r>
         <w:t>3.3. Diagramas de secuencia UML</w:t>
       </w:r>
@@ -37948,7 +39112,7 @@
       <w:pPr>
         <w:pStyle w:val="Titulo11"/>
       </w:pPr>
-      <w:bookmarkStart w:id="29" w:name="_Toc243617017"/>
+      <w:bookmarkStart w:id="29" w:name="_Toc243618606"/>
       <w:r>
         <w:t>3.4. Diagrama de clases UML</w:t>
       </w:r>
@@ -38097,7 +39261,7 @@
       <w:pPr>
         <w:pStyle w:val="Titulo11"/>
       </w:pPr>
-      <w:bookmarkStart w:id="30" w:name="_Toc243617018"/>
+      <w:bookmarkStart w:id="30" w:name="_Toc243618607"/>
       <w:r>
         <w:t>3.5. Diseño de la base de datos</w:t>
       </w:r>
@@ -38120,7 +39284,7 @@
       <w:pPr>
         <w:pStyle w:val="Titulo11"/>
       </w:pPr>
-      <w:bookmarkStart w:id="31" w:name="_Toc243617019"/>
+      <w:bookmarkStart w:id="31" w:name="_Toc243618608"/>
       <w:r>
         <w:t>3.6. Diseño de interfaces de usuario</w:t>
       </w:r>
@@ -38274,7 +39438,7 @@
       <w:pPr>
         <w:pStyle w:val="CAPITULO"/>
       </w:pPr>
-      <w:bookmarkStart w:id="32" w:name="_Toc243617020"/>
+      <w:bookmarkStart w:id="32" w:name="_Toc243618609"/>
       <w:r>
         <w:t>CAPÍTULO IV. DESARROLLO E IMPLEMENTACIÓN</w:t>
       </w:r>
@@ -38284,7 +39448,7 @@
       <w:pPr>
         <w:pStyle w:val="Titulo11"/>
       </w:pPr>
-      <w:bookmarkStart w:id="33" w:name="_Toc243617021"/>
+      <w:bookmarkStart w:id="33" w:name="_Toc243618610"/>
       <w:r>
         <w:t>4.1. Herramientas y tecnologías utilizadas</w:t>
       </w:r>
@@ -39772,7 +40936,7 @@
       <w:pPr>
         <w:pStyle w:val="Titulo11"/>
       </w:pPr>
-      <w:bookmarkStart w:id="34" w:name="_Toc243617022"/>
+      <w:bookmarkStart w:id="34" w:name="_Toc243618611"/>
       <w:r>
         <w:t>4.2. Diseño de la arquitectura del sistema</w:t>
       </w:r>
@@ -39795,7 +40959,7 @@
       <w:pPr>
         <w:pStyle w:val="Titulo11"/>
       </w:pPr>
-      <w:bookmarkStart w:id="35" w:name="_Toc243617023"/>
+      <w:bookmarkStart w:id="35" w:name="_Toc243618612"/>
       <w:r>
         <w:t>4.3. Implementación de la base de datos</w:t>
       </w:r>
@@ -39818,7 +40982,7 @@
       <w:pPr>
         <w:pStyle w:val="Titulo11"/>
       </w:pPr>
-      <w:bookmarkStart w:id="36" w:name="_Toc243617024"/>
+      <w:bookmarkStart w:id="36" w:name="_Toc243618613"/>
       <w:r>
         <w:t>4.4. Desarrollo de los módulos del sistema</w:t>
       </w:r>
@@ -39841,7 +41005,7 @@
       <w:pPr>
         <w:pStyle w:val="Titulo11"/>
       </w:pPr>
-      <w:bookmarkStart w:id="37" w:name="_Toc243617025"/>
+      <w:bookmarkStart w:id="37" w:name="_Toc243618614"/>
       <w:r>
         <w:t>4.5. Integración de componentes</w:t>
       </w:r>
@@ -39869,7 +41033,7 @@
       <w:pPr>
         <w:pStyle w:val="CAPITULO"/>
       </w:pPr>
-      <w:bookmarkStart w:id="38" w:name="_Toc243617026"/>
+      <w:bookmarkStart w:id="38" w:name="_Toc243618615"/>
       <w:r>
         <w:t>CAPÍTULO V. PRUEBAS Y RESULTADOS</w:t>
       </w:r>
@@ -39879,7 +41043,7 @@
       <w:pPr>
         <w:pStyle w:val="Titulo11"/>
       </w:pPr>
-      <w:bookmarkStart w:id="39" w:name="_Toc243617027"/>
+      <w:bookmarkStart w:id="39" w:name="_Toc243618616"/>
       <w:r>
         <w:t>5.1. Plan de pruebas</w:t>
       </w:r>
@@ -39978,7 +41142,7 @@
       <w:pPr>
         <w:pStyle w:val="Titulo11"/>
       </w:pPr>
-      <w:bookmarkStart w:id="40" w:name="_Toc243617028"/>
+      <w:bookmarkStart w:id="40" w:name="_Toc243618617"/>
       <w:r>
         <w:t>5.2. Pruebas funcionales</w:t>
       </w:r>
@@ -40001,7 +41165,7 @@
       <w:pPr>
         <w:pStyle w:val="Titulo11"/>
       </w:pPr>
-      <w:bookmarkStart w:id="41" w:name="_Toc243617029"/>
+      <w:bookmarkStart w:id="41" w:name="_Toc243618618"/>
       <w:r>
         <w:t>5.3. Pruebas de integración</w:t>
       </w:r>
@@ -40024,7 +41188,7 @@
       <w:pPr>
         <w:pStyle w:val="Titulo11"/>
       </w:pPr>
-      <w:bookmarkStart w:id="42" w:name="_Toc243617030"/>
+      <w:bookmarkStart w:id="42" w:name="_Toc243618619"/>
       <w:r>
         <w:t>5.4. Corrección de errores</w:t>
       </w:r>
@@ -40047,7 +41211,7 @@
       <w:pPr>
         <w:pStyle w:val="Titulo11"/>
       </w:pPr>
-      <w:bookmarkStart w:id="43" w:name="_Toc243617031"/>
+      <w:bookmarkStart w:id="43" w:name="_Toc243618620"/>
       <w:r>
         <w:t>5.5. Resultados de las pruebas</w:t>
       </w:r>
@@ -40070,7 +41234,7 @@
       <w:pPr>
         <w:pStyle w:val="Titulo11"/>
       </w:pPr>
-      <w:bookmarkStart w:id="44" w:name="_Toc243617032"/>
+      <w:bookmarkStart w:id="44" w:name="_Toc243618621"/>
       <w:r>
         <w:t>5.6. Casos de prueba</w:t>
       </w:r>
@@ -40098,7 +41262,7 @@
       <w:pPr>
         <w:pStyle w:val="CAPITULO"/>
       </w:pPr>
-      <w:bookmarkStart w:id="45" w:name="_Toc243617033"/>
+      <w:bookmarkStart w:id="45" w:name="_Toc243618622"/>
       <w:r>
         <w:t>CAPÍTULO VI. CONCLUSIONES Y RECOMENDACIONES</w:t>
       </w:r>
@@ -40108,7 +41272,7 @@
       <w:pPr>
         <w:pStyle w:val="Titulo11"/>
       </w:pPr>
-      <w:bookmarkStart w:id="46" w:name="_Toc243617034"/>
+      <w:bookmarkStart w:id="46" w:name="_Toc243618623"/>
       <w:r>
         <w:t>6.1. Conclusiones</w:t>
       </w:r>
@@ -40131,7 +41295,7 @@
       <w:pPr>
         <w:pStyle w:val="Titulo11"/>
       </w:pPr>
-      <w:bookmarkStart w:id="47" w:name="_Toc243617035"/>
+      <w:bookmarkStart w:id="47" w:name="_Toc243618624"/>
       <w:r>
         <w:t>6.2. Recomendaciones</w:t>
       </w:r>
@@ -40159,7 +41323,7 @@
       <w:pPr>
         <w:pStyle w:val="CAPITULO"/>
       </w:pPr>
-      <w:bookmarkStart w:id="48" w:name="_Toc243617036"/>
+      <w:bookmarkStart w:id="48" w:name="_Toc243618625"/>
       <w:r>
         <w:t>7. BIBLIOGRAFÍA</w:t>
       </w:r>
@@ -40324,7 +41488,7 @@
       <w:pPr>
         <w:pStyle w:val="CAPITULO"/>
       </w:pPr>
-      <w:bookmarkStart w:id="49" w:name="_Toc243617037"/>
+      <w:bookmarkStart w:id="49" w:name="_Toc243618626"/>
       <w:r>
         <w:t>8. ANEXOS</w:t>
       </w:r>
@@ -40334,7 +41498,7 @@
       <w:pPr>
         <w:pStyle w:val="Titulo11"/>
       </w:pPr>
-      <w:bookmarkStart w:id="50" w:name="_Toc243617038"/>
+      <w:bookmarkStart w:id="50" w:name="_Toc243618627"/>
       <w:r>
         <w:t>Anexo 1. Casos de uso del primer parcial</w:t>
       </w:r>
@@ -46089,7 +47253,7 @@
           <w:noProof/>
         </w:rPr>
         <w:drawing>
-          <wp:anchor distT="0" distB="0" distL="114300" distR="114300" simplePos="0" relativeHeight="251656704" behindDoc="1" locked="0" layoutInCell="1" allowOverlap="1" wp14:anchorId="7D50D6D1" wp14:editId="13ACC9CB">
+          <wp:anchor distT="0" distB="0" distL="114300" distR="114300" simplePos="0" relativeHeight="251656704" behindDoc="1" locked="0" layoutInCell="1" allowOverlap="1" wp14:anchorId="7D50D6D1" wp14:editId="285775EC">
             <wp:simplePos x="0" y="0"/>
             <wp:positionH relativeFrom="margin">
               <wp:align>center</wp:align>
@@ -46213,7 +47377,7 @@
       <w:pPr>
         <w:pStyle w:val="Titulo11"/>
       </w:pPr>
-      <w:bookmarkStart w:id="51" w:name="_Toc243617039"/>
+      <w:bookmarkStart w:id="51" w:name="_Toc243618628"/>
       <w:r>
         <w:t>Anexo 2. Enlaces</w:t>
       </w:r>

</xml_diff>